<commit_message>
Agrego opcion para ver el postrad3 de tc en foxfet
</commit_message>
<xml_diff>
--- a/Plan de tesis - Litardo.docx
+++ b/Plan de tesis - Litardo.docx
@@ -1,6 +1,6 @@
 
 <file path=word/document.xml><?xml version="1.0" encoding="utf-8"?>
-<w:document xmlns:wpc="http://schemas.microsoft.com/office/word/2010/wordprocessingCanvas" xmlns:cx="http://schemas.microsoft.com/office/drawing/2014/chartex" xmlns:cx1="http://schemas.microsoft.com/office/drawing/2015/9/8/chartex" xmlns:cx2="http://schemas.microsoft.com/office/drawing/2015/10/21/chartex" xmlns:cx3="http://schemas.microsoft.com/office/drawing/2016/5/9/chartex" xmlns:cx4="http://schemas.microsoft.com/office/drawing/2016/5/10/chartex" xmlns:cx5="http://schemas.microsoft.com/office/drawing/2016/5/11/chartex" xmlns:cx6="http://schemas.microsoft.com/office/drawing/2016/5/12/chartex" xmlns:cx7="http://schemas.microsoft.com/office/drawing/2016/5/13/chartex" xmlns:cx8="http://schemas.microsoft.com/office/drawing/2016/5/14/chartex" xmlns:mc="http://schemas.openxmlformats.org/markup-compatibility/2006" xmlns:aink="http://schemas.microsoft.com/office/drawing/2016/ink" xmlns:am3d="http://schemas.microsoft.com/office/drawing/2017/model3d" xmlns:o="urn:schemas-microsoft-com:office:office" xmlns:oel="http://schemas.microsoft.com/office/2019/extlst" xmlns:r="http://schemas.openxmlformats.org/officeDocument/2006/relationships" xmlns:m="http://schemas.openxmlformats.org/officeDocument/2006/math" xmlns:v="urn:schemas-microsoft-com:vml" xmlns:wp14="http://schemas.microsoft.com/office/word/2010/wordprocessingDrawing" xmlns:wp="http://schemas.openxmlformats.org/drawingml/2006/wordprocessingDrawing" xmlns:w10="urn:schemas-microsoft-com:office:word" xmlns:w="http://schemas.openxmlformats.org/wordprocessingml/2006/main" xmlns:w14="http://schemas.microsoft.com/office/word/2010/wordml" xmlns:w15="http://schemas.microsoft.com/office/word/2012/wordml" xmlns:w16cex="http://schemas.microsoft.com/office/word/2018/wordml/cex" xmlns:w16cid="http://schemas.microsoft.com/office/word/2016/wordml/cid" xmlns:w16="http://schemas.microsoft.com/office/word/2018/wordml" xmlns:w16sdtdh="http://schemas.microsoft.com/office/word/2020/wordml/sdtdatahash" xmlns:w16se="http://schemas.microsoft.com/office/word/2015/wordml/symex" xmlns:wpg="http://schemas.microsoft.com/office/word/2010/wordprocessingGroup" xmlns:wpi="http://schemas.microsoft.com/office/word/2010/wordprocessingInk" xmlns:wne="http://schemas.microsoft.com/office/word/2006/wordml" xmlns:wps="http://schemas.microsoft.com/office/word/2010/wordprocessingShape" mc:Ignorable="w14 w15 w16se w16cid w16 w16cex w16sdtdh wp14">
+<w:document xmlns:wpc="http://schemas.microsoft.com/office/word/2010/wordprocessingCanvas" xmlns:cx="http://schemas.microsoft.com/office/drawing/2014/chartex" xmlns:cx1="http://schemas.microsoft.com/office/drawing/2015/9/8/chartex" xmlns:cx2="http://schemas.microsoft.com/office/drawing/2015/10/21/chartex" xmlns:cx3="http://schemas.microsoft.com/office/drawing/2016/5/9/chartex" xmlns:cx4="http://schemas.microsoft.com/office/drawing/2016/5/10/chartex" xmlns:cx5="http://schemas.microsoft.com/office/drawing/2016/5/11/chartex" xmlns:cx6="http://schemas.microsoft.com/office/drawing/2016/5/12/chartex" xmlns:cx7="http://schemas.microsoft.com/office/drawing/2016/5/13/chartex" xmlns:cx8="http://schemas.microsoft.com/office/drawing/2016/5/14/chartex" xmlns:mc="http://schemas.openxmlformats.org/markup-compatibility/2006" xmlns:aink="http://schemas.microsoft.com/office/drawing/2016/ink" xmlns:am3d="http://schemas.microsoft.com/office/drawing/2017/model3d" xmlns:o="urn:schemas-microsoft-com:office:office" xmlns:oel="http://schemas.microsoft.com/office/2019/extlst" xmlns:r="http://schemas.openxmlformats.org/officeDocument/2006/relationships" xmlns:m="http://schemas.openxmlformats.org/officeDocument/2006/math" xmlns:v="urn:schemas-microsoft-com:vml" xmlns:wp14="http://schemas.microsoft.com/office/word/2010/wordprocessingDrawing" xmlns:wp="http://schemas.openxmlformats.org/drawingml/2006/wordprocessingDrawing" xmlns:w10="urn:schemas-microsoft-com:office:word" xmlns:w="http://schemas.openxmlformats.org/wordprocessingml/2006/main" xmlns:w14="http://schemas.microsoft.com/office/word/2010/wordml" xmlns:w15="http://schemas.microsoft.com/office/word/2012/wordml" xmlns:w16cex="http://schemas.microsoft.com/office/word/2018/wordml/cex" xmlns:w16cid="http://schemas.microsoft.com/office/word/2016/wordml/cid" xmlns:w16="http://schemas.microsoft.com/office/word/2018/wordml" xmlns:w16du="http://schemas.microsoft.com/office/word/2023/wordml/word16du" xmlns:w16sdtdh="http://schemas.microsoft.com/office/word/2020/wordml/sdtdatahash" xmlns:w16sdtfl="http://schemas.microsoft.com/office/word/2024/wordml/sdtformatlock" xmlns:w16se="http://schemas.microsoft.com/office/word/2015/wordml/symex" xmlns:wpg="http://schemas.microsoft.com/office/word/2010/wordprocessingGroup" xmlns:wpi="http://schemas.microsoft.com/office/word/2010/wordprocessingInk" xmlns:wne="http://schemas.microsoft.com/office/word/2006/wordml" xmlns:wps="http://schemas.microsoft.com/office/word/2010/wordprocessingShape" mc:Ignorable="w14 w15 w16se w16cid w16 w16cex w16sdtdh w16sdtfl w16du wp14">
   <w:body>
     <w:p>
       <w:pPr>
@@ -175,7 +175,19 @@
         <w:rPr>
           <w:rFonts w:ascii="Times New Roman" w:hAnsi="Times New Roman" w:cs="Times New Roman"/>
         </w:rPr>
-        <w:t xml:space="preserve"> 9 11 </w:t>
+        <w:t xml:space="preserve"> 9 </w:t>
+      </w:r>
+      <w:r>
+        <w:rPr>
+          <w:rFonts w:ascii="Times New Roman" w:hAnsi="Times New Roman" w:cs="Times New Roman"/>
+        </w:rPr>
+        <w:t>3489356784</w:t>
+      </w:r>
+      <w:r>
+        <w:rPr>
+          <w:rFonts w:ascii="Times New Roman" w:hAnsi="Times New Roman" w:cs="Times New Roman"/>
+        </w:rPr>
+        <w:t xml:space="preserve"> </w:t>
       </w:r>
     </w:p>
     <w:p>
@@ -240,16 +252,8 @@
         <w:rPr>
           <w:rFonts w:ascii="Times New Roman" w:hAnsi="Times New Roman" w:cs="Times New Roman"/>
         </w:rPr>
-        <w:t xml:space="preserve">Sebastián Horacio </w:t>
-      </w:r>
-      <w:proofErr w:type="spellStart"/>
-      <w:r>
-        <w:rPr>
-          <w:rFonts w:ascii="Times New Roman" w:hAnsi="Times New Roman" w:cs="Times New Roman"/>
-        </w:rPr>
-        <w:t>Carbonetto</w:t>
-      </w:r>
-      <w:proofErr w:type="spellEnd"/>
+        <w:t>Sebastián Horacio Carbonetto</w:t>
+      </w:r>
     </w:p>
     <w:p>
       <w:pPr>
@@ -331,21 +335,12 @@
           <w:rFonts w:ascii="Times New Roman" w:hAnsi="Times New Roman" w:cs="Times New Roman"/>
         </w:rPr>
       </w:pPr>
-      <w:proofErr w:type="spellStart"/>
       <w:r>
         <w:rPr>
           <w:rFonts w:ascii="Times New Roman" w:hAnsi="Times New Roman" w:cs="Times New Roman"/>
           <w:u w:val="single"/>
         </w:rPr>
-        <w:t>Co-director</w:t>
-      </w:r>
-      <w:proofErr w:type="spellEnd"/>
-      <w:r>
-        <w:rPr>
-          <w:rFonts w:ascii="Times New Roman" w:hAnsi="Times New Roman" w:cs="Times New Roman"/>
-          <w:u w:val="single"/>
-        </w:rPr>
-        <w:t>:</w:t>
+        <w:t>Co-director:</w:t>
       </w:r>
     </w:p>
     <w:p>
@@ -370,21 +365,7 @@
         <w:rPr>
           <w:rFonts w:ascii="Times New Roman" w:hAnsi="Times New Roman" w:cs="Times New Roman"/>
         </w:rPr>
-        <w:t xml:space="preserve">Lucas </w:t>
-      </w:r>
-      <w:proofErr w:type="spellStart"/>
-      <w:r>
-        <w:rPr>
-          <w:rFonts w:ascii="Times New Roman" w:hAnsi="Times New Roman" w:cs="Times New Roman"/>
-        </w:rPr>
-        <w:t>Sambuco</w:t>
-      </w:r>
-      <w:proofErr w:type="spellEnd"/>
-      <w:r>
-        <w:rPr>
-          <w:rFonts w:ascii="Times New Roman" w:hAnsi="Times New Roman" w:cs="Times New Roman"/>
-        </w:rPr>
-        <w:t xml:space="preserve"> Salomone</w:t>
+        <w:t>Lucas Sambuco Salomone</w:t>
       </w:r>
     </w:p>
     <w:p>
@@ -623,23 +604,13 @@
         </w:rPr>
         <w:t>de compuerta flotante (</w:t>
       </w:r>
-      <w:proofErr w:type="spellStart"/>
       <w:r>
         <w:rPr>
           <w:rFonts w:ascii="Times New Roman" w:hAnsi="Times New Roman" w:cs="Times New Roman"/>
           <w:i/>
           <w:iCs/>
         </w:rPr>
-        <w:t>floating</w:t>
-      </w:r>
-      <w:proofErr w:type="spellEnd"/>
-      <w:r>
-        <w:rPr>
-          <w:rFonts w:ascii="Times New Roman" w:hAnsi="Times New Roman" w:cs="Times New Roman"/>
-          <w:i/>
-          <w:iCs/>
-        </w:rPr>
-        <w:t xml:space="preserve"> gate</w:t>
+        <w:t>floating gate</w:t>
       </w:r>
       <w:r>
         <w:rPr>
@@ -883,201 +854,519 @@
         </w:rPr>
         <w:t>. La tendencia actual a la proliferación de pequeños satélites que emplean componentes COTS (</w:t>
       </w:r>
-      <w:proofErr w:type="spellStart"/>
       <w:r>
         <w:rPr>
           <w:rFonts w:ascii="Times New Roman" w:hAnsi="Times New Roman" w:cs="Times New Roman"/>
           <w:i/>
           <w:iCs/>
         </w:rPr>
-        <w:t>commercial</w:t>
-      </w:r>
-      <w:proofErr w:type="spellEnd"/>
+        <w:t>commercial-off-the-shelf</w:t>
+      </w:r>
+      <w:r>
+        <w:rPr>
+          <w:rFonts w:ascii="Times New Roman" w:hAnsi="Times New Roman" w:cs="Times New Roman"/>
+        </w:rPr>
+        <w:t xml:space="preserve">) vuelve </w:t>
+      </w:r>
+      <w:r>
+        <w:rPr>
+          <w:rFonts w:ascii="Times New Roman" w:hAnsi="Times New Roman" w:cs="Times New Roman"/>
+        </w:rPr>
+        <w:t xml:space="preserve">imprescindible </w:t>
+      </w:r>
+      <w:r>
+        <w:rPr>
+          <w:rFonts w:ascii="Times New Roman" w:hAnsi="Times New Roman" w:cs="Times New Roman"/>
+        </w:rPr>
+        <w:t>medir</w:t>
+      </w:r>
+      <w:r>
+        <w:rPr>
+          <w:rFonts w:ascii="Times New Roman" w:hAnsi="Times New Roman" w:cs="Times New Roman"/>
+        </w:rPr>
+        <w:t xml:space="preserve"> la dosis absorbida durante la misión. </w:t>
+      </w:r>
+      <w:r>
+        <w:rPr>
+          <w:rFonts w:ascii="Times New Roman" w:hAnsi="Times New Roman" w:cs="Times New Roman"/>
+        </w:rPr>
+        <w:t xml:space="preserve">En </w:t>
+      </w:r>
+      <w:r>
+        <w:rPr>
+          <w:rFonts w:ascii="Times New Roman" w:hAnsi="Times New Roman" w:cs="Times New Roman"/>
+        </w:rPr>
+        <w:t xml:space="preserve">el caso de </w:t>
+      </w:r>
+      <w:r>
+        <w:rPr>
+          <w:rFonts w:ascii="Times New Roman" w:hAnsi="Times New Roman" w:cs="Times New Roman"/>
+        </w:rPr>
+        <w:t>la industria nuclear</w:t>
+      </w:r>
+      <w:r>
+        <w:rPr>
+          <w:rFonts w:ascii="Times New Roman" w:hAnsi="Times New Roman" w:cs="Times New Roman"/>
+        </w:rPr>
+        <w:t xml:space="preserve"> o algunas actividades científicas tales como los </w:t>
+      </w:r>
+      <w:r>
+        <w:rPr>
+          <w:rFonts w:ascii="Times New Roman" w:hAnsi="Times New Roman" w:cs="Times New Roman"/>
+        </w:rPr>
+        <w:t>aceleradores</w:t>
+      </w:r>
+      <w:r>
+        <w:rPr>
+          <w:rFonts w:ascii="Times New Roman" w:hAnsi="Times New Roman" w:cs="Times New Roman"/>
+        </w:rPr>
+        <w:t xml:space="preserve"> de partículas</w:t>
+      </w:r>
+      <w:r>
+        <w:rPr>
+          <w:rFonts w:ascii="Times New Roman" w:hAnsi="Times New Roman" w:cs="Times New Roman"/>
+        </w:rPr>
+        <w:t>,</w:t>
+      </w:r>
+      <w:r>
+        <w:rPr>
+          <w:rFonts w:ascii="Times New Roman" w:hAnsi="Times New Roman" w:cs="Times New Roman"/>
+        </w:rPr>
+        <w:t xml:space="preserve"> la estimación de la dosis presente en el ambiente está directamente relacionada con la seguridad de los trabajadores expuestos a la radiación. </w:t>
+      </w:r>
+      <w:r>
+        <w:rPr>
+          <w:rFonts w:ascii="Times New Roman" w:hAnsi="Times New Roman" w:cs="Times New Roman"/>
+        </w:rPr>
+        <w:t>En medicina, la radiación se utiliza en distintos tratamientos</w:t>
+      </w:r>
+      <w:r>
+        <w:rPr>
+          <w:rFonts w:ascii="Times New Roman" w:hAnsi="Times New Roman" w:cs="Times New Roman"/>
+        </w:rPr>
+        <w:t>, así como también en procedimientos de diagnóstico,</w:t>
+      </w:r>
+      <w:r>
+        <w:rPr>
+          <w:rFonts w:ascii="Times New Roman" w:hAnsi="Times New Roman" w:cs="Times New Roman"/>
+        </w:rPr>
+        <w:t xml:space="preserve"> y el buen uso de la misma determina </w:t>
+      </w:r>
+      <w:r>
+        <w:rPr>
+          <w:rFonts w:ascii="Times New Roman" w:hAnsi="Times New Roman" w:cs="Times New Roman"/>
+        </w:rPr>
+        <w:t>la</w:t>
+      </w:r>
+      <w:r>
+        <w:rPr>
+          <w:rFonts w:ascii="Times New Roman" w:hAnsi="Times New Roman" w:cs="Times New Roman"/>
+        </w:rPr>
+        <w:t xml:space="preserve"> efectividad</w:t>
+      </w:r>
+      <w:r>
+        <w:rPr>
+          <w:rFonts w:ascii="Times New Roman" w:hAnsi="Times New Roman" w:cs="Times New Roman"/>
+        </w:rPr>
+        <w:t xml:space="preserve"> y seguridad de estos</w:t>
+      </w:r>
+      <w:r>
+        <w:rPr>
+          <w:rFonts w:ascii="Times New Roman" w:hAnsi="Times New Roman" w:cs="Times New Roman"/>
+        </w:rPr>
+        <w:t>. En cualquier</w:t>
+      </w:r>
+      <w:r>
+        <w:rPr>
+          <w:rFonts w:ascii="Times New Roman" w:hAnsi="Times New Roman" w:cs="Times New Roman"/>
+        </w:rPr>
+        <w:t>a</w:t>
+      </w:r>
+      <w:r>
+        <w:rPr>
+          <w:rFonts w:ascii="Times New Roman" w:hAnsi="Times New Roman" w:cs="Times New Roman"/>
+        </w:rPr>
+        <w:t xml:space="preserve"> </w:t>
+      </w:r>
+      <w:r>
+        <w:rPr>
+          <w:rFonts w:ascii="Times New Roman" w:hAnsi="Times New Roman" w:cs="Times New Roman"/>
+        </w:rPr>
+        <w:t xml:space="preserve">de los </w:t>
+      </w:r>
+      <w:r>
+        <w:rPr>
+          <w:rFonts w:ascii="Times New Roman" w:hAnsi="Times New Roman" w:cs="Times New Roman"/>
+        </w:rPr>
+        <w:t>caso</w:t>
+      </w:r>
+      <w:r>
+        <w:rPr>
+          <w:rFonts w:ascii="Times New Roman" w:hAnsi="Times New Roman" w:cs="Times New Roman"/>
+        </w:rPr>
+        <w:t>s mencionados</w:t>
+      </w:r>
+      <w:r>
+        <w:rPr>
+          <w:rFonts w:ascii="Times New Roman" w:hAnsi="Times New Roman" w:cs="Times New Roman"/>
+        </w:rPr>
+        <w:t>, existe la necesidad de medir la radiación presente en los distintos ambientes.</w:t>
+      </w:r>
+    </w:p>
+    <w:p>
+      <w:pPr>
+        <w:spacing w:line="240" w:lineRule="auto"/>
+        <w:jc w:val="both"/>
+        <w:rPr>
+          <w:rFonts w:ascii="Times New Roman" w:hAnsi="Times New Roman" w:cs="Times New Roman"/>
+        </w:rPr>
+      </w:pPr>
+    </w:p>
+    <w:p>
+      <w:pPr>
+        <w:spacing w:line="240" w:lineRule="auto"/>
+        <w:jc w:val="both"/>
+        <w:rPr>
+          <w:rFonts w:ascii="Times New Roman" w:hAnsi="Times New Roman" w:cs="Times New Roman"/>
+        </w:rPr>
+      </w:pPr>
+      <w:r>
+        <w:rPr>
+          <w:rFonts w:ascii="Times New Roman" w:hAnsi="Times New Roman" w:cs="Times New Roman"/>
+        </w:rPr>
+        <w:t>El uso de transistores MOSFET</w:t>
+      </w:r>
+      <w:r>
+        <w:rPr>
+          <w:rFonts w:ascii="Times New Roman" w:hAnsi="Times New Roman" w:cs="Times New Roman"/>
+        </w:rPr>
+        <w:t xml:space="preserve"> (</w:t>
+      </w:r>
       <w:r>
         <w:rPr>
           <w:rFonts w:ascii="Times New Roman" w:hAnsi="Times New Roman" w:cs="Times New Roman"/>
           <w:i/>
           <w:iCs/>
         </w:rPr>
-        <w:t>-off-</w:t>
-      </w:r>
-      <w:proofErr w:type="spellStart"/>
+        <w:t>metal-oxide-semiconductor field-effect transistor</w:t>
+      </w:r>
+      <w:r>
+        <w:rPr>
+          <w:rFonts w:ascii="Times New Roman" w:hAnsi="Times New Roman" w:cs="Times New Roman"/>
+        </w:rPr>
+        <w:t>)</w:t>
+      </w:r>
+      <w:r>
+        <w:rPr>
+          <w:rFonts w:ascii="Times New Roman" w:hAnsi="Times New Roman" w:cs="Times New Roman"/>
+        </w:rPr>
+        <w:t xml:space="preserve"> como sensores de radiación ionizante ha sido estudiado exhaustivamente desde l</w:t>
+      </w:r>
+      <w:r>
+        <w:rPr>
+          <w:rFonts w:ascii="Times New Roman" w:hAnsi="Times New Roman" w:cs="Times New Roman"/>
+        </w:rPr>
+        <w:t>a década del setenta</w:t>
+      </w:r>
+      <w:r>
+        <w:rPr>
+          <w:rFonts w:ascii="Times New Roman" w:hAnsi="Times New Roman" w:cs="Times New Roman"/>
+        </w:rPr>
+        <w:t xml:space="preserve"> cuando fue propuesto por primera vez [Poch1970]. Inicialmente, </w:t>
+      </w:r>
+      <w:r>
+        <w:rPr>
+          <w:rFonts w:ascii="Times New Roman" w:hAnsi="Times New Roman" w:cs="Times New Roman"/>
+        </w:rPr>
+        <w:t xml:space="preserve">fueron </w:t>
+      </w:r>
+      <w:r>
+        <w:rPr>
+          <w:rFonts w:ascii="Times New Roman" w:hAnsi="Times New Roman" w:cs="Times New Roman"/>
+        </w:rPr>
+        <w:t>aplicado</w:t>
+      </w:r>
+      <w:r>
+        <w:rPr>
+          <w:rFonts w:ascii="Times New Roman" w:hAnsi="Times New Roman" w:cs="Times New Roman"/>
+        </w:rPr>
+        <w:t>s</w:t>
+      </w:r>
+      <w:r>
+        <w:rPr>
+          <w:rFonts w:ascii="Times New Roman" w:hAnsi="Times New Roman" w:cs="Times New Roman"/>
+        </w:rPr>
+        <w:t xml:space="preserve"> a la medición de dosis en el espacio [Adams1978], pero su estudio</w:t>
+      </w:r>
+      <w:r>
+        <w:rPr>
+          <w:rFonts w:ascii="Times New Roman" w:hAnsi="Times New Roman" w:cs="Times New Roman"/>
+        </w:rPr>
+        <w:t xml:space="preserve"> posterior</w:t>
+      </w:r>
+      <w:r>
+        <w:rPr>
+          <w:rFonts w:ascii="Times New Roman" w:hAnsi="Times New Roman" w:cs="Times New Roman"/>
+        </w:rPr>
+        <w:t xml:space="preserve"> permitió mejorar las prestaciones de los sensores para así ser aplicados a distintos campos, como la radioterapia [Rosenfeld2002], </w:t>
+      </w:r>
+      <w:r>
+        <w:rPr>
+          <w:rFonts w:ascii="Times New Roman" w:hAnsi="Times New Roman" w:cs="Times New Roman"/>
+        </w:rPr>
+        <w:t>radiodiagnóstico [Carbonetto2014], y los últimos esfuerzos se centran en alcanzar los límites establecidos por la dosimetría personal [Chatterjee2020].</w:t>
+      </w:r>
+    </w:p>
+    <w:p>
+      <w:pPr>
+        <w:spacing w:line="240" w:lineRule="auto"/>
+        <w:jc w:val="both"/>
+        <w:rPr>
+          <w:rFonts w:ascii="Times New Roman" w:hAnsi="Times New Roman" w:cs="Times New Roman"/>
+        </w:rPr>
+      </w:pPr>
+    </w:p>
+    <w:p>
+      <w:pPr>
+        <w:spacing w:line="240" w:lineRule="auto"/>
+        <w:ind w:left="720" w:hanging="720"/>
+        <w:jc w:val="both"/>
+        <w:rPr>
+          <w:rFonts w:ascii="Times New Roman" w:hAnsi="Times New Roman" w:cs="Times New Roman"/>
+        </w:rPr>
+      </w:pPr>
+      <w:r>
+        <w:rPr>
+          <w:rFonts w:ascii="Times New Roman" w:hAnsi="Times New Roman" w:cs="Times New Roman"/>
+        </w:rPr>
+        <w:t>Los dosímetros basados en transistores MOSFET basan su funcionamiento en la captura de carga</w:t>
+      </w:r>
+    </w:p>
+    <w:p>
+      <w:pPr>
+        <w:spacing w:line="240" w:lineRule="auto"/>
+        <w:ind w:left="720" w:hanging="720"/>
+        <w:jc w:val="both"/>
+        <w:rPr>
+          <w:rFonts w:ascii="Times New Roman" w:hAnsi="Times New Roman" w:cs="Times New Roman"/>
+        </w:rPr>
+      </w:pPr>
+      <w:r>
+        <w:rPr>
+          <w:rFonts w:ascii="Times New Roman" w:hAnsi="Times New Roman" w:cs="Times New Roman"/>
+        </w:rPr>
+        <w:t>positiva en imperfecciones del óxido de compuerta. Cuando un haz de radiación interactúa con el</w:t>
+      </w:r>
+    </w:p>
+    <w:p>
+      <w:pPr>
+        <w:spacing w:line="240" w:lineRule="auto"/>
+        <w:ind w:left="720" w:hanging="720"/>
+        <w:jc w:val="both"/>
+        <w:rPr>
+          <w:rFonts w:ascii="Times New Roman" w:hAnsi="Times New Roman" w:cs="Times New Roman"/>
+        </w:rPr>
+      </w:pPr>
+      <w:r>
+        <w:rPr>
+          <w:rFonts w:ascii="Times New Roman" w:hAnsi="Times New Roman" w:cs="Times New Roman"/>
+        </w:rPr>
+        <w:t xml:space="preserve">aislante se generan </w:t>
+      </w:r>
+      <w:r>
+        <w:rPr>
+          <w:rFonts w:ascii="Times New Roman" w:hAnsi="Times New Roman" w:cs="Times New Roman"/>
+        </w:rPr>
+        <w:t xml:space="preserve">dentro de él </w:t>
+      </w:r>
+      <w:r>
+        <w:rPr>
+          <w:rFonts w:ascii="Times New Roman" w:hAnsi="Times New Roman" w:cs="Times New Roman"/>
+        </w:rPr>
+        <w:t>pares electrón-hueco. Una fracción de los huecos pueden quedar</w:t>
+      </w:r>
+    </w:p>
+    <w:p>
+      <w:pPr>
+        <w:spacing w:line="240" w:lineRule="auto"/>
+        <w:ind w:left="720" w:hanging="720"/>
+        <w:jc w:val="both"/>
+        <w:rPr>
+          <w:rFonts w:ascii="Times New Roman" w:hAnsi="Times New Roman" w:cs="Times New Roman"/>
+        </w:rPr>
+      </w:pPr>
+      <w:r>
+        <w:rPr>
+          <w:rFonts w:ascii="Times New Roman" w:hAnsi="Times New Roman" w:cs="Times New Roman"/>
+        </w:rPr>
+        <w:t>capturados en defectos en el óxido. Esta carga positiva tiene como efecto la variación de la tensión</w:t>
+      </w:r>
+    </w:p>
+    <w:p>
+      <w:pPr>
+        <w:spacing w:line="240" w:lineRule="auto"/>
+        <w:ind w:left="720" w:hanging="720"/>
+        <w:jc w:val="both"/>
+        <w:rPr>
+          <w:rFonts w:ascii="Times New Roman" w:hAnsi="Times New Roman" w:cs="Times New Roman"/>
+        </w:rPr>
+      </w:pPr>
+      <w:r>
+        <w:rPr>
+          <w:rFonts w:ascii="Times New Roman" w:hAnsi="Times New Roman" w:cs="Times New Roman"/>
+        </w:rPr>
+        <w:t>umbral (V</w:t>
+      </w:r>
+      <w:r>
+        <w:rPr>
+          <w:rFonts w:ascii="Times New Roman" w:hAnsi="Times New Roman" w:cs="Times New Roman"/>
+          <w:vertAlign w:val="subscript"/>
+        </w:rPr>
+        <w:t>T</w:t>
+      </w:r>
+      <w:r>
+        <w:rPr>
+          <w:rFonts w:ascii="Times New Roman" w:hAnsi="Times New Roman" w:cs="Times New Roman"/>
+        </w:rPr>
+        <w:t>), parámetro característico de los transistores MOS [Oldham2003, Barnaby2006,</w:t>
+      </w:r>
+    </w:p>
+    <w:p>
+      <w:pPr>
+        <w:spacing w:line="240" w:lineRule="auto"/>
+        <w:ind w:left="720" w:hanging="720"/>
+        <w:jc w:val="both"/>
+        <w:rPr>
+          <w:rFonts w:ascii="Times New Roman" w:hAnsi="Times New Roman" w:cs="Times New Roman"/>
+        </w:rPr>
+      </w:pPr>
+      <w:r>
+        <w:rPr>
+          <w:rFonts w:ascii="Times New Roman" w:hAnsi="Times New Roman" w:cs="Times New Roman"/>
+        </w:rPr>
+        <w:t>Schwank2008].</w:t>
+      </w:r>
+    </w:p>
+    <w:p>
+      <w:pPr>
+        <w:spacing w:line="240" w:lineRule="auto"/>
+        <w:jc w:val="both"/>
+        <w:rPr>
+          <w:rFonts w:ascii="Times New Roman" w:hAnsi="Times New Roman" w:cs="Times New Roman"/>
+        </w:rPr>
+      </w:pPr>
+    </w:p>
+    <w:p>
+      <w:pPr>
+        <w:spacing w:line="240" w:lineRule="auto"/>
+        <w:jc w:val="both"/>
+        <w:rPr>
+          <w:rFonts w:ascii="Times New Roman" w:hAnsi="Times New Roman" w:cs="Times New Roman"/>
+        </w:rPr>
+      </w:pPr>
+      <w:r>
+        <w:rPr>
+          <w:rFonts w:ascii="Times New Roman" w:hAnsi="Times New Roman" w:cs="Times New Roman"/>
+        </w:rPr>
+        <w:t>La sensibilidad del dosímetro MOS aumenta con el espesor de la capa de óxido [Viswanathan1976]. Este comportamiento va en contra de la tendencia tecnológica que busca reducir las dimensiones de los dispositivos [Fleetwood2018]</w:t>
+      </w:r>
+      <w:r>
+        <w:rPr>
+          <w:rFonts w:ascii="Times New Roman" w:hAnsi="Times New Roman" w:cs="Times New Roman"/>
+        </w:rPr>
+        <w:t xml:space="preserve">, por lo que se requieren procesos de fabricación alternativos para alcanzar niveles aceptables de sensibilidad. </w:t>
+      </w:r>
+      <w:r>
+        <w:rPr>
+          <w:rFonts w:ascii="Times New Roman" w:hAnsi="Times New Roman" w:cs="Times New Roman"/>
+        </w:rPr>
+        <w:t>Por este motivo, en los últimos años se ha propuesto aprovecha</w:t>
+      </w:r>
+      <w:r>
+        <w:rPr>
+          <w:rFonts w:ascii="Times New Roman" w:hAnsi="Times New Roman" w:cs="Times New Roman"/>
+        </w:rPr>
+        <w:t>r</w:t>
+      </w:r>
+      <w:r>
+        <w:rPr>
+          <w:rFonts w:ascii="Times New Roman" w:hAnsi="Times New Roman" w:cs="Times New Roman"/>
+        </w:rPr>
+        <w:t xml:space="preserve"> los óxidos de pasivación de los procesos de fabricación CMOS estándar</w:t>
+      </w:r>
+      <w:r>
+        <w:rPr>
+          <w:rFonts w:ascii="Times New Roman" w:hAnsi="Times New Roman" w:cs="Times New Roman"/>
+        </w:rPr>
+        <w:t>es</w:t>
+      </w:r>
+      <w:r>
+        <w:rPr>
+          <w:rFonts w:ascii="Times New Roman" w:hAnsi="Times New Roman" w:cs="Times New Roman"/>
+        </w:rPr>
+        <w:t xml:space="preserve"> para desarrollar sensores MOS de radiación ionizante de alta sensibilidad y potencial bajo costo</w:t>
+      </w:r>
+      <w:r>
+        <w:rPr>
+          <w:rFonts w:ascii="Times New Roman" w:hAnsi="Times New Roman" w:cs="Times New Roman"/>
+        </w:rPr>
+        <w:t>.</w:t>
+      </w:r>
+      <w:r>
+        <w:rPr>
+          <w:rFonts w:ascii="Times New Roman" w:hAnsi="Times New Roman" w:cs="Times New Roman"/>
+        </w:rPr>
+        <w:t xml:space="preserve"> Entre ellos pueden destacarse el FOXFET</w:t>
+      </w:r>
+      <w:r>
+        <w:rPr>
+          <w:rFonts w:ascii="Times New Roman" w:hAnsi="Times New Roman" w:cs="Times New Roman"/>
+        </w:rPr>
+        <w:t xml:space="preserve"> (</w:t>
+      </w:r>
       <w:r>
         <w:rPr>
           <w:rFonts w:ascii="Times New Roman" w:hAnsi="Times New Roman" w:cs="Times New Roman"/>
           <w:i/>
           <w:iCs/>
         </w:rPr>
-        <w:t>the</w:t>
-      </w:r>
-      <w:proofErr w:type="spellEnd"/>
-      <w:r>
-        <w:rPr>
-          <w:rFonts w:ascii="Times New Roman" w:hAnsi="Times New Roman" w:cs="Times New Roman"/>
-          <w:i/>
-          <w:iCs/>
-        </w:rPr>
-        <w:t>-</w:t>
-      </w:r>
-      <w:proofErr w:type="spellStart"/>
-      <w:r>
-        <w:rPr>
-          <w:rFonts w:ascii="Times New Roman" w:hAnsi="Times New Roman" w:cs="Times New Roman"/>
-          <w:i/>
-          <w:iCs/>
-        </w:rPr>
-        <w:t>shelf</w:t>
-      </w:r>
-      <w:proofErr w:type="spellEnd"/>
-      <w:r>
-        <w:rPr>
-          <w:rFonts w:ascii="Times New Roman" w:hAnsi="Times New Roman" w:cs="Times New Roman"/>
-        </w:rPr>
-        <w:t xml:space="preserve">) vuelve </w:t>
-      </w:r>
-      <w:r>
-        <w:rPr>
-          <w:rFonts w:ascii="Times New Roman" w:hAnsi="Times New Roman" w:cs="Times New Roman"/>
-        </w:rPr>
-        <w:t xml:space="preserve">imprescindible </w:t>
-      </w:r>
-      <w:r>
-        <w:rPr>
-          <w:rFonts w:ascii="Times New Roman" w:hAnsi="Times New Roman" w:cs="Times New Roman"/>
-        </w:rPr>
-        <w:t>medir</w:t>
-      </w:r>
-      <w:r>
-        <w:rPr>
-          <w:rFonts w:ascii="Times New Roman" w:hAnsi="Times New Roman" w:cs="Times New Roman"/>
-        </w:rPr>
-        <w:t xml:space="preserve"> la dosis absorbida durante la misión. </w:t>
-      </w:r>
-      <w:r>
-        <w:rPr>
-          <w:rFonts w:ascii="Times New Roman" w:hAnsi="Times New Roman" w:cs="Times New Roman"/>
-        </w:rPr>
-        <w:t xml:space="preserve">En </w:t>
-      </w:r>
-      <w:r>
-        <w:rPr>
-          <w:rFonts w:ascii="Times New Roman" w:hAnsi="Times New Roman" w:cs="Times New Roman"/>
-        </w:rPr>
-        <w:t xml:space="preserve">el caso de </w:t>
-      </w:r>
-      <w:r>
-        <w:rPr>
-          <w:rFonts w:ascii="Times New Roman" w:hAnsi="Times New Roman" w:cs="Times New Roman"/>
-        </w:rPr>
-        <w:t>la industria nuclear</w:t>
-      </w:r>
-      <w:r>
-        <w:rPr>
-          <w:rFonts w:ascii="Times New Roman" w:hAnsi="Times New Roman" w:cs="Times New Roman"/>
-        </w:rPr>
-        <w:t xml:space="preserve"> o algunas actividades científicas tales como los </w:t>
-      </w:r>
-      <w:r>
-        <w:rPr>
-          <w:rFonts w:ascii="Times New Roman" w:hAnsi="Times New Roman" w:cs="Times New Roman"/>
-        </w:rPr>
-        <w:t>aceleradores</w:t>
-      </w:r>
-      <w:r>
-        <w:rPr>
-          <w:rFonts w:ascii="Times New Roman" w:hAnsi="Times New Roman" w:cs="Times New Roman"/>
-        </w:rPr>
-        <w:t xml:space="preserve"> de partículas</w:t>
-      </w:r>
-      <w:r>
-        <w:rPr>
-          <w:rFonts w:ascii="Times New Roman" w:hAnsi="Times New Roman" w:cs="Times New Roman"/>
-        </w:rPr>
-        <w:t>,</w:t>
-      </w:r>
-      <w:r>
-        <w:rPr>
-          <w:rFonts w:ascii="Times New Roman" w:hAnsi="Times New Roman" w:cs="Times New Roman"/>
-        </w:rPr>
-        <w:t xml:space="preserve"> la estimación de la dosis presente en el ambiente está directamente relacionada con la seguridad de los trabajadores expuestos a la radiación. </w:t>
-      </w:r>
-      <w:r>
-        <w:rPr>
-          <w:rFonts w:ascii="Times New Roman" w:hAnsi="Times New Roman" w:cs="Times New Roman"/>
-        </w:rPr>
-        <w:t>En medicina, la radiación se utiliza en distintos tratamientos</w:t>
-      </w:r>
-      <w:r>
-        <w:rPr>
-          <w:rFonts w:ascii="Times New Roman" w:hAnsi="Times New Roman" w:cs="Times New Roman"/>
-        </w:rPr>
-        <w:t>, así como también en procedimientos de diagnóstico,</w:t>
-      </w:r>
-      <w:r>
-        <w:rPr>
-          <w:rFonts w:ascii="Times New Roman" w:hAnsi="Times New Roman" w:cs="Times New Roman"/>
-        </w:rPr>
-        <w:t xml:space="preserve"> y el buen uso de la misma determina </w:t>
-      </w:r>
-      <w:r>
-        <w:rPr>
-          <w:rFonts w:ascii="Times New Roman" w:hAnsi="Times New Roman" w:cs="Times New Roman"/>
-        </w:rPr>
-        <w:t>la</w:t>
-      </w:r>
-      <w:r>
-        <w:rPr>
-          <w:rFonts w:ascii="Times New Roman" w:hAnsi="Times New Roman" w:cs="Times New Roman"/>
-        </w:rPr>
-        <w:t xml:space="preserve"> efectividad</w:t>
-      </w:r>
-      <w:r>
-        <w:rPr>
-          <w:rFonts w:ascii="Times New Roman" w:hAnsi="Times New Roman" w:cs="Times New Roman"/>
-        </w:rPr>
-        <w:t xml:space="preserve"> y seguridad de estos</w:t>
-      </w:r>
-      <w:r>
-        <w:rPr>
-          <w:rFonts w:ascii="Times New Roman" w:hAnsi="Times New Roman" w:cs="Times New Roman"/>
-        </w:rPr>
-        <w:t>. En cualquier</w:t>
-      </w:r>
-      <w:r>
-        <w:rPr>
-          <w:rFonts w:ascii="Times New Roman" w:hAnsi="Times New Roman" w:cs="Times New Roman"/>
-        </w:rPr>
-        <w:t>a</w:t>
-      </w:r>
-      <w:r>
-        <w:rPr>
-          <w:rFonts w:ascii="Times New Roman" w:hAnsi="Times New Roman" w:cs="Times New Roman"/>
-        </w:rPr>
-        <w:t xml:space="preserve"> </w:t>
-      </w:r>
-      <w:r>
-        <w:rPr>
-          <w:rFonts w:ascii="Times New Roman" w:hAnsi="Times New Roman" w:cs="Times New Roman"/>
-        </w:rPr>
-        <w:t xml:space="preserve">de los </w:t>
-      </w:r>
-      <w:r>
-        <w:rPr>
-          <w:rFonts w:ascii="Times New Roman" w:hAnsi="Times New Roman" w:cs="Times New Roman"/>
-        </w:rPr>
-        <w:t>caso</w:t>
-      </w:r>
-      <w:r>
-        <w:rPr>
-          <w:rFonts w:ascii="Times New Roman" w:hAnsi="Times New Roman" w:cs="Times New Roman"/>
-        </w:rPr>
-        <w:t>s mencionados</w:t>
-      </w:r>
-      <w:r>
-        <w:rPr>
-          <w:rFonts w:ascii="Times New Roman" w:hAnsi="Times New Roman" w:cs="Times New Roman"/>
-        </w:rPr>
-        <w:t>, existe la necesidad de medir la radiación presente en los distintos ambientes.</w:t>
+        <w:t>field-oxide field-effect transistor</w:t>
+      </w:r>
+      <w:r>
+        <w:rPr>
+          <w:rFonts w:ascii="Times New Roman" w:hAnsi="Times New Roman" w:cs="Times New Roman"/>
+        </w:rPr>
+        <w:t>)</w:t>
+      </w:r>
+      <w:r>
+        <w:rPr>
+          <w:rFonts w:ascii="Times New Roman" w:hAnsi="Times New Roman" w:cs="Times New Roman"/>
+        </w:rPr>
+        <w:t xml:space="preserve"> [Lipovetzky2013, GarciaInza2014, Carbonetto2014, GarciaInza2016, GarciaInza2018, Carbonetto2020] y los transistores de compuerta flotante extendida sobre el óxido de campo (FGMOSFET) [Peters1996]. </w:t>
+      </w:r>
+      <w:r>
+        <w:rPr>
+          <w:rFonts w:ascii="Times New Roman" w:hAnsi="Times New Roman" w:cs="Times New Roman"/>
+        </w:rPr>
+        <w:t xml:space="preserve">El segundo de los </w:t>
+      </w:r>
+      <w:r>
+        <w:rPr>
+          <w:rFonts w:ascii="Times New Roman" w:hAnsi="Times New Roman" w:cs="Times New Roman"/>
+        </w:rPr>
+        <w:t xml:space="preserve">dispositivos mencionados </w:t>
+      </w:r>
+      <w:r>
+        <w:rPr>
+          <w:rFonts w:ascii="Times New Roman" w:hAnsi="Times New Roman" w:cs="Times New Roman"/>
+        </w:rPr>
+        <w:t>es</w:t>
+      </w:r>
+      <w:r>
+        <w:rPr>
+          <w:rFonts w:ascii="Times New Roman" w:hAnsi="Times New Roman" w:cs="Times New Roman"/>
+        </w:rPr>
+        <w:t xml:space="preserve"> el objeto de estudio de este plan de trabajo.</w:t>
       </w:r>
     </w:p>
     <w:p>
@@ -1101,105 +1390,7 @@
         <w:rPr>
           <w:rFonts w:ascii="Times New Roman" w:hAnsi="Times New Roman" w:cs="Times New Roman"/>
         </w:rPr>
-        <w:t>El uso de transistores MOSFET</w:t>
-      </w:r>
-      <w:r>
-        <w:rPr>
-          <w:rFonts w:ascii="Times New Roman" w:hAnsi="Times New Roman" w:cs="Times New Roman"/>
-        </w:rPr>
-        <w:t xml:space="preserve"> (</w:t>
-      </w:r>
-      <w:r>
-        <w:rPr>
-          <w:rFonts w:ascii="Times New Roman" w:hAnsi="Times New Roman" w:cs="Times New Roman"/>
-          <w:i/>
-          <w:iCs/>
-        </w:rPr>
-        <w:t xml:space="preserve">metal-oxide-semiconductor </w:t>
-      </w:r>
-      <w:proofErr w:type="spellStart"/>
-      <w:r>
-        <w:rPr>
-          <w:rFonts w:ascii="Times New Roman" w:hAnsi="Times New Roman" w:cs="Times New Roman"/>
-          <w:i/>
-          <w:iCs/>
-        </w:rPr>
-        <w:t>field-effect</w:t>
-      </w:r>
-      <w:proofErr w:type="spellEnd"/>
-      <w:r>
-        <w:rPr>
-          <w:rFonts w:ascii="Times New Roman" w:hAnsi="Times New Roman" w:cs="Times New Roman"/>
-          <w:i/>
-          <w:iCs/>
-        </w:rPr>
-        <w:t xml:space="preserve"> transistor</w:t>
-      </w:r>
-      <w:r>
-        <w:rPr>
-          <w:rFonts w:ascii="Times New Roman" w:hAnsi="Times New Roman" w:cs="Times New Roman"/>
-        </w:rPr>
-        <w:t>)</w:t>
-      </w:r>
-      <w:r>
-        <w:rPr>
-          <w:rFonts w:ascii="Times New Roman" w:hAnsi="Times New Roman" w:cs="Times New Roman"/>
-        </w:rPr>
-        <w:t xml:space="preserve"> como sensores de radiación ionizante ha sido estudiado exhaustivamente desde l</w:t>
-      </w:r>
-      <w:r>
-        <w:rPr>
-          <w:rFonts w:ascii="Times New Roman" w:hAnsi="Times New Roman" w:cs="Times New Roman"/>
-        </w:rPr>
-        <w:t>a década del setenta</w:t>
-      </w:r>
-      <w:r>
-        <w:rPr>
-          <w:rFonts w:ascii="Times New Roman" w:hAnsi="Times New Roman" w:cs="Times New Roman"/>
-        </w:rPr>
-        <w:t xml:space="preserve"> cuando fue propuesto por primera vez [Poch1970]. Inicialmente, </w:t>
-      </w:r>
-      <w:r>
-        <w:rPr>
-          <w:rFonts w:ascii="Times New Roman" w:hAnsi="Times New Roman" w:cs="Times New Roman"/>
-        </w:rPr>
-        <w:t xml:space="preserve">fueron </w:t>
-      </w:r>
-      <w:r>
-        <w:rPr>
-          <w:rFonts w:ascii="Times New Roman" w:hAnsi="Times New Roman" w:cs="Times New Roman"/>
-        </w:rPr>
-        <w:t>aplicado</w:t>
-      </w:r>
-      <w:r>
-        <w:rPr>
-          <w:rFonts w:ascii="Times New Roman" w:hAnsi="Times New Roman" w:cs="Times New Roman"/>
-        </w:rPr>
-        <w:t>s</w:t>
-      </w:r>
-      <w:r>
-        <w:rPr>
-          <w:rFonts w:ascii="Times New Roman" w:hAnsi="Times New Roman" w:cs="Times New Roman"/>
-        </w:rPr>
-        <w:t xml:space="preserve"> a la medición de dosis en el espacio [Adams1978], pero su estudio</w:t>
-      </w:r>
-      <w:r>
-        <w:rPr>
-          <w:rFonts w:ascii="Times New Roman" w:hAnsi="Times New Roman" w:cs="Times New Roman"/>
-        </w:rPr>
-        <w:t xml:space="preserve"> posterior</w:t>
-      </w:r>
-      <w:r>
-        <w:rPr>
-          <w:rFonts w:ascii="Times New Roman" w:hAnsi="Times New Roman" w:cs="Times New Roman"/>
-        </w:rPr>
-        <w:t xml:space="preserve"> permitió mejorar las prestaciones de los sensores para así ser aplicados a distintos campos, como la radioterapia [Rosenfeld2002], </w:t>
-      </w:r>
-      <w:r>
-        <w:rPr>
-          <w:rFonts w:ascii="Times New Roman" w:hAnsi="Times New Roman" w:cs="Times New Roman"/>
-        </w:rPr>
-        <w:t>radiodiagnóstico [Carbonetto2014], y los últimos esfuerzos se centran en alcanzar los límites establecidos por la dosimetría personal [Chatterjee2020].</w:t>
+        <w:t>Los transistores de compuerta flotante son transistores MOSFET donde el electrodo de compuerta está eléctricamente aislado. Esto quiere decir que no se puede tener control directo del potencial de compuerta mediante conexión eléctrica y, por lo tanto, de la corriente del dispositivo. Sin embargo, el potencial de compuerta puede variar mediante la inyección de carga a la compuerta flotante a través de corrientes de túnel que atraviesan la barrera de potencial que impone el material aislante que rodea a la compuerta. Cuando la carga es suficiente para que el potencial de compuerta supere a la tensión umbral, podrá circular corriente por el dispositivo cuando se aplica una tensión entre drain y source.</w:t>
       </w:r>
     </w:p>
     <w:p>
@@ -1223,92 +1414,139 @@
         <w:rPr>
           <w:rFonts w:ascii="Times New Roman" w:hAnsi="Times New Roman" w:cs="Times New Roman"/>
         </w:rPr>
-        <w:t xml:space="preserve">Los dosímetros basados en transistores MOSFET basan su funcionamiento en la captura de carga positiva en imperfecciones del óxido de compuerta. Cuando un haz de radiación interactúa con el aislante se generan </w:t>
-      </w:r>
-      <w:r>
-        <w:rPr>
-          <w:rFonts w:ascii="Times New Roman" w:hAnsi="Times New Roman" w:cs="Times New Roman"/>
-        </w:rPr>
-        <w:t xml:space="preserve">dentro de él </w:t>
-      </w:r>
-      <w:r>
-        <w:rPr>
-          <w:rFonts w:ascii="Times New Roman" w:hAnsi="Times New Roman" w:cs="Times New Roman"/>
-        </w:rPr>
-        <w:t>pares electrón-hueco. Una fracción de los huecos pueden quedar capturados en defectos en el óxido. Esta carga positiva tiene como efecto la variación de la tensión umbral (V</w:t>
-      </w:r>
-      <w:r>
-        <w:rPr>
-          <w:rFonts w:ascii="Times New Roman" w:hAnsi="Times New Roman" w:cs="Times New Roman"/>
-          <w:vertAlign w:val="subscript"/>
-        </w:rPr>
-        <w:t>T</w:t>
-      </w:r>
-      <w:r>
-        <w:rPr>
-          <w:rFonts w:ascii="Times New Roman" w:hAnsi="Times New Roman" w:cs="Times New Roman"/>
-        </w:rPr>
-        <w:t>), parámetro característico de los transistores MOS [Oldham2003, Barnaby2006, Schwank2008].</w:t>
-      </w:r>
-    </w:p>
-    <w:p>
-      <w:pPr>
-        <w:spacing w:line="240" w:lineRule="auto"/>
-        <w:jc w:val="both"/>
-        <w:rPr>
-          <w:rFonts w:ascii="Times New Roman" w:hAnsi="Times New Roman" w:cs="Times New Roman"/>
-        </w:rPr>
-      </w:pPr>
-    </w:p>
-    <w:p>
-      <w:pPr>
-        <w:spacing w:line="240" w:lineRule="auto"/>
-        <w:jc w:val="both"/>
-        <w:rPr>
-          <w:rFonts w:ascii="Times New Roman" w:hAnsi="Times New Roman" w:cs="Times New Roman"/>
-        </w:rPr>
-      </w:pPr>
-      <w:r>
-        <w:rPr>
-          <w:rFonts w:ascii="Times New Roman" w:hAnsi="Times New Roman" w:cs="Times New Roman"/>
-        </w:rPr>
-        <w:t>La sensibilidad del dosímetro MOS aumenta con el espesor de la capa de óxido [Viswanathan1976]. Este comportamiento va en contra de la tendencia tecnológica que busca reducir las dimensiones de los dispositivos [Fleetwood2018]</w:t>
-      </w:r>
-      <w:r>
-        <w:rPr>
-          <w:rFonts w:ascii="Times New Roman" w:hAnsi="Times New Roman" w:cs="Times New Roman"/>
-        </w:rPr>
-        <w:t xml:space="preserve">, por lo que se requieren procesos de fabricación alternativos para alcanzar niveles aceptables de sensibilidad. </w:t>
-      </w:r>
-      <w:r>
-        <w:rPr>
-          <w:rFonts w:ascii="Times New Roman" w:hAnsi="Times New Roman" w:cs="Times New Roman"/>
-        </w:rPr>
-        <w:t>Por este motivo, en los últimos años se ha propuesto aprovecha</w:t>
-      </w:r>
-      <w:r>
-        <w:rPr>
-          <w:rFonts w:ascii="Times New Roman" w:hAnsi="Times New Roman" w:cs="Times New Roman"/>
-        </w:rPr>
-        <w:t>r</w:t>
-      </w:r>
-      <w:r>
-        <w:rPr>
-          <w:rFonts w:ascii="Times New Roman" w:hAnsi="Times New Roman" w:cs="Times New Roman"/>
-        </w:rPr>
-        <w:t xml:space="preserve"> los óxidos de pasivación de los procesos de fabricación CMOS estándar</w:t>
-      </w:r>
-      <w:r>
-        <w:rPr>
-          <w:rFonts w:ascii="Times New Roman" w:hAnsi="Times New Roman" w:cs="Times New Roman"/>
-        </w:rPr>
-        <w:t>es</w:t>
-      </w:r>
-      <w:r>
-        <w:rPr>
-          <w:rFonts w:ascii="Times New Roman" w:hAnsi="Times New Roman" w:cs="Times New Roman"/>
-        </w:rPr>
-        <w:t xml:space="preserve"> para desarrollar sensores MOS de radiación ionizante de alta sensibilidad y potencial bajo costo</w:t>
+        <w:t>El efecto que provoca la radiación sobre los dispositivos FGMOSFET es descargar la compuerta flotante y, por lo tanto, disminuir la corriente que puede circular por el dispositivo [Kassabov1991]. Con el fin de aumentar su sensibilidad, la compuerta flotante puede extenderse más allá de la región activa del dispositivo MOS, depositándose parcialmente sobre el óxido de campo [Peters1996]. Para que el sensor sea reutilizable, se propone incorporar un electrodo de inyección de carga para llevar al sensor a un estado de conducción [Tarr2004].</w:t>
+      </w:r>
+      <w:r>
+        <w:rPr>
+          <w:rFonts w:ascii="Times New Roman" w:hAnsi="Times New Roman" w:cs="Times New Roman"/>
+        </w:rPr>
+        <w:t xml:space="preserve"> Este tipo de dosímetros posee la ventaja de contar con un óxido grueso para la generación de la carga inducida por radiación, a la vez que el dispositivo lector corresponde a un dispositivo estándar del proceso de fabricación, con un óxido delgado, lo que supone una mayor estabilidad frente a dispositivos fabricados con óxidos gruesos en procesos espaciales. </w:t>
+      </w:r>
+      <w:r>
+        <w:rPr>
+          <w:rFonts w:ascii="Times New Roman" w:hAnsi="Times New Roman" w:cs="Times New Roman"/>
+        </w:rPr>
+        <w:t xml:space="preserve">Además, las tensiones y corrientes </w:t>
+      </w:r>
+      <w:r>
+        <w:rPr>
+          <w:rFonts w:ascii="Times New Roman" w:hAnsi="Times New Roman" w:cs="Times New Roman"/>
+        </w:rPr>
+        <w:t xml:space="preserve">empleadas se encuentran </w:t>
+      </w:r>
+      <w:r>
+        <w:rPr>
+          <w:rFonts w:ascii="Times New Roman" w:hAnsi="Times New Roman" w:cs="Times New Roman"/>
+        </w:rPr>
+        <w:t xml:space="preserve">dentro del rango estándar del proceso de fabricación. Por último, al estar la compuerta flotante eléctricamente aislada se espera que, ante la ausencia de radiación, </w:t>
+      </w:r>
+      <w:r>
+        <w:rPr>
+          <w:rFonts w:ascii="Times New Roman" w:hAnsi="Times New Roman" w:cs="Times New Roman"/>
+        </w:rPr>
+        <w:t xml:space="preserve">estos sensores </w:t>
+      </w:r>
+      <w:r>
+        <w:rPr>
+          <w:rFonts w:ascii="Times New Roman" w:hAnsi="Times New Roman" w:cs="Times New Roman"/>
+        </w:rPr>
+        <w:t xml:space="preserve">sean capaces de retener la carga almacenada y, por lo tanto, la información de </w:t>
+      </w:r>
+      <w:r>
+        <w:rPr>
+          <w:rFonts w:ascii="Times New Roman" w:hAnsi="Times New Roman" w:cs="Times New Roman"/>
+        </w:rPr>
+        <w:t xml:space="preserve">la </w:t>
+      </w:r>
+      <w:r>
+        <w:rPr>
+          <w:rFonts w:ascii="Times New Roman" w:hAnsi="Times New Roman" w:cs="Times New Roman"/>
+        </w:rPr>
+        <w:t>dosis</w:t>
+      </w:r>
+      <w:r>
+        <w:rPr>
+          <w:rFonts w:ascii="Times New Roman" w:hAnsi="Times New Roman" w:cs="Times New Roman"/>
+        </w:rPr>
+        <w:t xml:space="preserve"> absorbida. </w:t>
+      </w:r>
+      <w:r>
+        <w:rPr>
+          <w:rFonts w:ascii="Times New Roman" w:hAnsi="Times New Roman" w:cs="Times New Roman"/>
+        </w:rPr>
+        <w:t xml:space="preserve">En los últimos años, se ha avanzado en el desarrollo de sensores de radiación </w:t>
+      </w:r>
+      <w:r>
+        <w:rPr>
+          <w:rFonts w:ascii="Times New Roman" w:hAnsi="Times New Roman" w:cs="Times New Roman"/>
+        </w:rPr>
+        <w:t>basados en dispositivos</w:t>
+      </w:r>
+      <w:r>
+        <w:rPr>
+          <w:rFonts w:ascii="Times New Roman" w:hAnsi="Times New Roman" w:cs="Times New Roman"/>
+        </w:rPr>
+        <w:t xml:space="preserve"> FGMOSFET con compuerta extendida [Tarr2004, Villani2016, Brucoli2017, Zhang2019, Chatterjee2020]. </w:t>
+      </w:r>
+      <w:r>
+        <w:rPr>
+          <w:rFonts w:ascii="Times New Roman" w:hAnsi="Times New Roman" w:cs="Times New Roman"/>
+        </w:rPr>
+        <w:t xml:space="preserve">La posibilidad de integrar este tipo de </w:t>
+      </w:r>
+      <w:r>
+        <w:rPr>
+          <w:rFonts w:ascii="Times New Roman" w:hAnsi="Times New Roman" w:cs="Times New Roman"/>
+        </w:rPr>
+        <w:t>estructuras</w:t>
+      </w:r>
+      <w:r>
+        <w:rPr>
+          <w:rFonts w:ascii="Times New Roman" w:hAnsi="Times New Roman" w:cs="Times New Roman"/>
+        </w:rPr>
+        <w:t xml:space="preserve"> en procesos de fabricación CMOS estándares permite que estos sean fabricados </w:t>
+      </w:r>
+      <w:r>
+        <w:rPr>
+          <w:rFonts w:ascii="Times New Roman" w:hAnsi="Times New Roman" w:cs="Times New Roman"/>
+        </w:rPr>
+        <w:t xml:space="preserve">en conjunto con la electrónica de lectura, encargada de </w:t>
+      </w:r>
+      <w:r>
+        <w:rPr>
+          <w:rFonts w:ascii="Times New Roman" w:hAnsi="Times New Roman" w:cs="Times New Roman"/>
+        </w:rPr>
+        <w:t>llevar a cabo</w:t>
+      </w:r>
+      <w:r>
+        <w:rPr>
+          <w:rFonts w:ascii="Times New Roman" w:hAnsi="Times New Roman" w:cs="Times New Roman"/>
+        </w:rPr>
+        <w:t xml:space="preserve"> </w:t>
+      </w:r>
+      <w:r>
+        <w:rPr>
+          <w:rFonts w:ascii="Times New Roman" w:hAnsi="Times New Roman" w:cs="Times New Roman"/>
+        </w:rPr>
+        <w:t>el</w:t>
+      </w:r>
+      <w:r>
+        <w:rPr>
+          <w:rFonts w:ascii="Times New Roman" w:hAnsi="Times New Roman" w:cs="Times New Roman"/>
+        </w:rPr>
+        <w:t xml:space="preserve"> procesamiento</w:t>
+      </w:r>
+      <w:r>
+        <w:rPr>
+          <w:rFonts w:ascii="Times New Roman" w:hAnsi="Times New Roman" w:cs="Times New Roman"/>
+        </w:rPr>
+        <w:t xml:space="preserve"> necesario</w:t>
+      </w:r>
+      <w:r>
+        <w:rPr>
+          <w:rFonts w:ascii="Times New Roman" w:hAnsi="Times New Roman" w:cs="Times New Roman"/>
+        </w:rPr>
+        <w:t xml:space="preserve"> de la señal</w:t>
       </w:r>
       <w:r>
         <w:rPr>
@@ -1320,305 +1558,19 @@
         <w:rPr>
           <w:rFonts w:ascii="Times New Roman" w:hAnsi="Times New Roman" w:cs="Times New Roman"/>
         </w:rPr>
-        <w:t xml:space="preserve"> Entre ellos pueden destacarse el FOXFET</w:t>
-      </w:r>
-      <w:r>
-        <w:rPr>
-          <w:rFonts w:ascii="Times New Roman" w:hAnsi="Times New Roman" w:cs="Times New Roman"/>
-        </w:rPr>
-        <w:t xml:space="preserve"> (</w:t>
-      </w:r>
-      <w:proofErr w:type="spellStart"/>
-      <w:r>
-        <w:rPr>
-          <w:rFonts w:ascii="Times New Roman" w:hAnsi="Times New Roman" w:cs="Times New Roman"/>
-          <w:i/>
-          <w:iCs/>
-        </w:rPr>
-        <w:t>field</w:t>
-      </w:r>
-      <w:proofErr w:type="spellEnd"/>
-      <w:r>
-        <w:rPr>
-          <w:rFonts w:ascii="Times New Roman" w:hAnsi="Times New Roman" w:cs="Times New Roman"/>
-          <w:i/>
-          <w:iCs/>
-        </w:rPr>
-        <w:t xml:space="preserve">-oxide </w:t>
-      </w:r>
-      <w:proofErr w:type="spellStart"/>
-      <w:r>
-        <w:rPr>
-          <w:rFonts w:ascii="Times New Roman" w:hAnsi="Times New Roman" w:cs="Times New Roman"/>
-          <w:i/>
-          <w:iCs/>
-        </w:rPr>
-        <w:t>field-effect</w:t>
-      </w:r>
-      <w:proofErr w:type="spellEnd"/>
-      <w:r>
-        <w:rPr>
-          <w:rFonts w:ascii="Times New Roman" w:hAnsi="Times New Roman" w:cs="Times New Roman"/>
-          <w:i/>
-          <w:iCs/>
-        </w:rPr>
-        <w:t xml:space="preserve"> transistor</w:t>
-      </w:r>
-      <w:r>
-        <w:rPr>
-          <w:rFonts w:ascii="Times New Roman" w:hAnsi="Times New Roman" w:cs="Times New Roman"/>
-        </w:rPr>
-        <w:t>)</w:t>
-      </w:r>
-      <w:r>
-        <w:rPr>
-          <w:rFonts w:ascii="Times New Roman" w:hAnsi="Times New Roman" w:cs="Times New Roman"/>
-        </w:rPr>
-        <w:t xml:space="preserve"> [Lipovetzky2013, GarciaInza2014, Carbonetto2014, GarciaInza2016, GarciaInza2018, Carbonetto2020] y los transistores de compuerta flotante extendida sobre el óxido de campo (FGMOSFET) [Peters1996]. </w:t>
-      </w:r>
-      <w:r>
-        <w:rPr>
-          <w:rFonts w:ascii="Times New Roman" w:hAnsi="Times New Roman" w:cs="Times New Roman"/>
-        </w:rPr>
-        <w:t xml:space="preserve">El segundo de los </w:t>
-      </w:r>
-      <w:r>
-        <w:rPr>
-          <w:rFonts w:ascii="Times New Roman" w:hAnsi="Times New Roman" w:cs="Times New Roman"/>
-        </w:rPr>
-        <w:t xml:space="preserve">dispositivos mencionados </w:t>
-      </w:r>
-      <w:r>
-        <w:rPr>
-          <w:rFonts w:ascii="Times New Roman" w:hAnsi="Times New Roman" w:cs="Times New Roman"/>
-        </w:rPr>
-        <w:t>es</w:t>
-      </w:r>
-      <w:r>
-        <w:rPr>
-          <w:rFonts w:ascii="Times New Roman" w:hAnsi="Times New Roman" w:cs="Times New Roman"/>
-        </w:rPr>
-        <w:t xml:space="preserve"> el objeto de estudio de este plan de trabajo.</w:t>
-      </w:r>
-    </w:p>
-    <w:p>
-      <w:pPr>
-        <w:spacing w:line="240" w:lineRule="auto"/>
-        <w:jc w:val="both"/>
-        <w:rPr>
-          <w:rFonts w:ascii="Times New Roman" w:hAnsi="Times New Roman" w:cs="Times New Roman"/>
-        </w:rPr>
-      </w:pPr>
-    </w:p>
-    <w:p>
-      <w:pPr>
-        <w:spacing w:line="240" w:lineRule="auto"/>
-        <w:jc w:val="both"/>
-        <w:rPr>
-          <w:rFonts w:ascii="Times New Roman" w:hAnsi="Times New Roman" w:cs="Times New Roman"/>
-        </w:rPr>
-      </w:pPr>
-      <w:r>
-        <w:rPr>
-          <w:rFonts w:ascii="Times New Roman" w:hAnsi="Times New Roman" w:cs="Times New Roman"/>
-        </w:rPr>
-        <w:t xml:space="preserve">Los transistores de compuerta flotante son transistores MOSFET donde el electrodo de compuerta está eléctricamente aislado. Esto quiere decir que no se puede tener control directo del potencial de compuerta mediante conexión eléctrica y, por lo tanto, de la corriente del dispositivo. Sin embargo, el potencial de compuerta puede variar mediante la inyección de carga a la compuerta flotante a través de corrientes de túnel que atraviesan la barrera de potencial que impone el material aislante que rodea a la compuerta. Cuando la carga es suficiente para que el potencial de compuerta supere a la tensión umbral, podrá circular corriente por el dispositivo cuando se aplica una tensión entre </w:t>
-      </w:r>
-      <w:proofErr w:type="spellStart"/>
-      <w:r>
-        <w:rPr>
-          <w:rFonts w:ascii="Times New Roman" w:hAnsi="Times New Roman" w:cs="Times New Roman"/>
-        </w:rPr>
-        <w:t>drain</w:t>
-      </w:r>
-      <w:proofErr w:type="spellEnd"/>
-      <w:r>
-        <w:rPr>
-          <w:rFonts w:ascii="Times New Roman" w:hAnsi="Times New Roman" w:cs="Times New Roman"/>
-        </w:rPr>
-        <w:t xml:space="preserve"> y </w:t>
-      </w:r>
-      <w:proofErr w:type="spellStart"/>
-      <w:r>
-        <w:rPr>
-          <w:rFonts w:ascii="Times New Roman" w:hAnsi="Times New Roman" w:cs="Times New Roman"/>
-        </w:rPr>
-        <w:t>source</w:t>
-      </w:r>
-      <w:proofErr w:type="spellEnd"/>
-      <w:r>
-        <w:rPr>
-          <w:rFonts w:ascii="Times New Roman" w:hAnsi="Times New Roman" w:cs="Times New Roman"/>
-        </w:rPr>
-        <w:t>.</w:t>
-      </w:r>
-    </w:p>
-    <w:p>
-      <w:pPr>
-        <w:spacing w:line="240" w:lineRule="auto"/>
-        <w:jc w:val="both"/>
-        <w:rPr>
-          <w:rFonts w:ascii="Times New Roman" w:hAnsi="Times New Roman" w:cs="Times New Roman"/>
-        </w:rPr>
-      </w:pPr>
-    </w:p>
-    <w:p>
-      <w:pPr>
-        <w:spacing w:line="240" w:lineRule="auto"/>
-        <w:jc w:val="both"/>
-        <w:rPr>
-          <w:rFonts w:ascii="Times New Roman" w:hAnsi="Times New Roman" w:cs="Times New Roman"/>
-        </w:rPr>
-      </w:pPr>
-      <w:r>
-        <w:rPr>
-          <w:rFonts w:ascii="Times New Roman" w:hAnsi="Times New Roman" w:cs="Times New Roman"/>
-        </w:rPr>
-        <w:t>El efecto que provoca la radiación sobre los dispositivos FGMOSFET es descargar la compuerta flotante y, por lo tanto, disminuir la corriente que puede circular por el dispositivo [Kassabov1991]. Con el fin de aumentar su sensibilidad, la compuerta flotante puede extenderse más allá de la región activa del dispositivo MOS, depositándose parcialmente sobre el óxido de campo [Peters1996]. Para que el sensor sea reutilizable, se propone incorporar un electrodo de inyección de carga para llevar al sensor a un estado de conducción [Tarr2004].</w:t>
-      </w:r>
-      <w:r>
-        <w:rPr>
-          <w:rFonts w:ascii="Times New Roman" w:hAnsi="Times New Roman" w:cs="Times New Roman"/>
-        </w:rPr>
-        <w:t xml:space="preserve"> Este tipo de dosímetros posee la ventaja de contar con un óxido grueso para la generación de la carga inducida por radiación, a la vez que el dispositivo lector corresponde a un dispositivo estándar del proceso de fabricación, con un óxido delgado, lo que supone una mayor estabilidad frente a dispositivos fabricados con óxidos gruesos en procesos espaciales. </w:t>
-      </w:r>
-      <w:r>
-        <w:rPr>
-          <w:rFonts w:ascii="Times New Roman" w:hAnsi="Times New Roman" w:cs="Times New Roman"/>
-        </w:rPr>
-        <w:t xml:space="preserve">Además, las tensiones y corrientes </w:t>
-      </w:r>
-      <w:r>
-        <w:rPr>
-          <w:rFonts w:ascii="Times New Roman" w:hAnsi="Times New Roman" w:cs="Times New Roman"/>
-        </w:rPr>
-        <w:t xml:space="preserve">empleadas se encuentran </w:t>
-      </w:r>
-      <w:r>
-        <w:rPr>
-          <w:rFonts w:ascii="Times New Roman" w:hAnsi="Times New Roman" w:cs="Times New Roman"/>
-        </w:rPr>
-        <w:t xml:space="preserve">dentro del rango estándar del proceso de fabricación. Por último, al estar la compuerta flotante eléctricamente aislada se espera que, ante la ausencia de radiación, </w:t>
-      </w:r>
-      <w:r>
-        <w:rPr>
-          <w:rFonts w:ascii="Times New Roman" w:hAnsi="Times New Roman" w:cs="Times New Roman"/>
-        </w:rPr>
-        <w:t xml:space="preserve">estos sensores </w:t>
-      </w:r>
-      <w:r>
-        <w:rPr>
-          <w:rFonts w:ascii="Times New Roman" w:hAnsi="Times New Roman" w:cs="Times New Roman"/>
-        </w:rPr>
-        <w:t xml:space="preserve">sean capaces de retener la carga almacenada y, por lo tanto, la información de </w:t>
-      </w:r>
-      <w:r>
-        <w:rPr>
-          <w:rFonts w:ascii="Times New Roman" w:hAnsi="Times New Roman" w:cs="Times New Roman"/>
-        </w:rPr>
-        <w:t xml:space="preserve">la </w:t>
-      </w:r>
-      <w:r>
-        <w:rPr>
-          <w:rFonts w:ascii="Times New Roman" w:hAnsi="Times New Roman" w:cs="Times New Roman"/>
-        </w:rPr>
-        <w:t>dosis</w:t>
-      </w:r>
-      <w:r>
-        <w:rPr>
-          <w:rFonts w:ascii="Times New Roman" w:hAnsi="Times New Roman" w:cs="Times New Roman"/>
-        </w:rPr>
-        <w:t xml:space="preserve"> absorbida. </w:t>
-      </w:r>
-      <w:r>
-        <w:rPr>
-          <w:rFonts w:ascii="Times New Roman" w:hAnsi="Times New Roman" w:cs="Times New Roman"/>
-        </w:rPr>
-        <w:t xml:space="preserve">En los últimos años, se ha avanzado en el desarrollo de sensores de radiación </w:t>
-      </w:r>
-      <w:r>
-        <w:rPr>
-          <w:rFonts w:ascii="Times New Roman" w:hAnsi="Times New Roman" w:cs="Times New Roman"/>
-        </w:rPr>
-        <w:t>basados en dispositivos</w:t>
-      </w:r>
-      <w:r>
-        <w:rPr>
-          <w:rFonts w:ascii="Times New Roman" w:hAnsi="Times New Roman" w:cs="Times New Roman"/>
-        </w:rPr>
-        <w:t xml:space="preserve"> FGMOSFET con compuerta extendida [Tarr2004, Villani2016, Brucoli2017, Zhang2019, Chatterjee2020]. </w:t>
-      </w:r>
-      <w:r>
-        <w:rPr>
-          <w:rFonts w:ascii="Times New Roman" w:hAnsi="Times New Roman" w:cs="Times New Roman"/>
-        </w:rPr>
-        <w:t xml:space="preserve">La posibilidad de integrar este tipo de </w:t>
-      </w:r>
-      <w:r>
-        <w:rPr>
-          <w:rFonts w:ascii="Times New Roman" w:hAnsi="Times New Roman" w:cs="Times New Roman"/>
-        </w:rPr>
-        <w:t>estructuras</w:t>
-      </w:r>
-      <w:r>
-        <w:rPr>
-          <w:rFonts w:ascii="Times New Roman" w:hAnsi="Times New Roman" w:cs="Times New Roman"/>
-        </w:rPr>
-        <w:t xml:space="preserve"> en procesos de fabricación CMOS estándares permite que estos sean fabricados </w:t>
-      </w:r>
-      <w:r>
-        <w:rPr>
-          <w:rFonts w:ascii="Times New Roman" w:hAnsi="Times New Roman" w:cs="Times New Roman"/>
-        </w:rPr>
-        <w:t xml:space="preserve">en conjunto con la electrónica de lectura, encargada de </w:t>
-      </w:r>
-      <w:r>
-        <w:rPr>
-          <w:rFonts w:ascii="Times New Roman" w:hAnsi="Times New Roman" w:cs="Times New Roman"/>
-        </w:rPr>
-        <w:t>llevar a cabo</w:t>
-      </w:r>
-      <w:r>
-        <w:rPr>
-          <w:rFonts w:ascii="Times New Roman" w:hAnsi="Times New Roman" w:cs="Times New Roman"/>
-        </w:rPr>
-        <w:t xml:space="preserve"> </w:t>
-      </w:r>
-      <w:r>
-        <w:rPr>
-          <w:rFonts w:ascii="Times New Roman" w:hAnsi="Times New Roman" w:cs="Times New Roman"/>
-        </w:rPr>
-        <w:t>el</w:t>
-      </w:r>
-      <w:r>
-        <w:rPr>
-          <w:rFonts w:ascii="Times New Roman" w:hAnsi="Times New Roman" w:cs="Times New Roman"/>
-        </w:rPr>
-        <w:t xml:space="preserve"> procesamiento</w:t>
-      </w:r>
-      <w:r>
-        <w:rPr>
-          <w:rFonts w:ascii="Times New Roman" w:hAnsi="Times New Roman" w:cs="Times New Roman"/>
-        </w:rPr>
-        <w:t xml:space="preserve"> necesario</w:t>
-      </w:r>
-      <w:r>
-        <w:rPr>
-          <w:rFonts w:ascii="Times New Roman" w:hAnsi="Times New Roman" w:cs="Times New Roman"/>
-        </w:rPr>
-        <w:t xml:space="preserve"> de la señal</w:t>
-      </w:r>
-      <w:r>
-        <w:rPr>
-          <w:rFonts w:ascii="Times New Roman" w:hAnsi="Times New Roman" w:cs="Times New Roman"/>
-        </w:rPr>
-        <w:t>.</w:t>
-      </w:r>
-      <w:r>
-        <w:rPr>
-          <w:rFonts w:ascii="Times New Roman" w:hAnsi="Times New Roman" w:cs="Times New Roman"/>
-        </w:rPr>
-        <w:t xml:space="preserve"> En el presente trabajo de tesis se pretende llevar a cabo un estudio detallado de la respuesta a la radiación de un dispositivo FGMOSFET fabricado en un proceso CMOS de 500 nm en vistas de tu utilización como sensor de radiación.</w:t>
+        <w:t xml:space="preserve"> En el presente trabajo de tesis se pretende llevar a cabo un estudio detallado de la respuesta a la radiación de un dispositivo FGMOSFET fabricado en un proceso CMOS de 500 nm en vistas de </w:t>
+      </w:r>
+      <w:r>
+        <w:rPr>
+          <w:rFonts w:ascii="Times New Roman" w:hAnsi="Times New Roman" w:cs="Times New Roman"/>
+        </w:rPr>
+        <w:t>s</w:t>
+      </w:r>
+      <w:r>
+        <w:rPr>
+          <w:rFonts w:ascii="Times New Roman" w:hAnsi="Times New Roman" w:cs="Times New Roman"/>
+        </w:rPr>
+        <w:t>u utilización como sensor de radiación.</w:t>
       </w:r>
     </w:p>
     <w:p>
@@ -1912,21 +1864,7 @@
         <w:rPr>
           <w:rFonts w:ascii="Times New Roman" w:hAnsi="Times New Roman" w:cs="Times New Roman"/>
         </w:rPr>
-        <w:t xml:space="preserve">La posibilidad de controlar la carga en la puerta flotante mediante la inyección pulsada de electrones a través del mecanismo de túnel de </w:t>
-      </w:r>
-      <w:proofErr w:type="spellStart"/>
-      <w:r>
-        <w:rPr>
-          <w:rFonts w:ascii="Times New Roman" w:hAnsi="Times New Roman" w:cs="Times New Roman"/>
-        </w:rPr>
-        <w:t>Fowler-Nordheim</w:t>
-      </w:r>
-      <w:proofErr w:type="spellEnd"/>
-      <w:r>
-        <w:rPr>
-          <w:rFonts w:ascii="Times New Roman" w:hAnsi="Times New Roman" w:cs="Times New Roman"/>
-        </w:rPr>
-        <w:t>.</w:t>
+        <w:t>La posibilidad de controlar la carga en la puerta flotante mediante la inyección pulsada de electrones a través del mecanismo de túnel de Fowler-Nordheim.</w:t>
       </w:r>
     </w:p>
     <w:p>
@@ -2507,51 +2445,13 @@
           <w:i/>
           <w:iCs/>
         </w:rPr>
-        <w:t>probe-</w:t>
-      </w:r>
-      <w:proofErr w:type="spellStart"/>
-      <w:r>
-        <w:rPr>
-          <w:rFonts w:ascii="Times New Roman" w:hAnsi="Times New Roman" w:cs="Times New Roman"/>
-          <w:i/>
-          <w:iCs/>
-        </w:rPr>
-        <w:t>station</w:t>
-      </w:r>
-      <w:proofErr w:type="spellEnd"/>
-      <w:r>
-        <w:rPr>
-          <w:rFonts w:ascii="Times New Roman" w:hAnsi="Times New Roman" w:cs="Times New Roman"/>
-        </w:rPr>
-        <w:t xml:space="preserve">) con </w:t>
-      </w:r>
-      <w:proofErr w:type="spellStart"/>
-      <w:r>
-        <w:rPr>
-          <w:rFonts w:ascii="Times New Roman" w:hAnsi="Times New Roman" w:cs="Times New Roman"/>
-        </w:rPr>
-        <w:t>micromanipuladores</w:t>
-      </w:r>
-      <w:proofErr w:type="spellEnd"/>
-      <w:r>
-        <w:rPr>
-          <w:rFonts w:ascii="Times New Roman" w:hAnsi="Times New Roman" w:cs="Times New Roman"/>
-        </w:rPr>
-        <w:t xml:space="preserve"> que permiten realizar contacto eléctrico en los </w:t>
-      </w:r>
-      <w:proofErr w:type="spellStart"/>
-      <w:r>
-        <w:rPr>
-          <w:rFonts w:ascii="Times New Roman" w:hAnsi="Times New Roman" w:cs="Times New Roman"/>
-        </w:rPr>
-        <w:t>PADs</w:t>
-      </w:r>
-      <w:proofErr w:type="spellEnd"/>
-      <w:r>
-        <w:rPr>
-          <w:rFonts w:ascii="Times New Roman" w:hAnsi="Times New Roman" w:cs="Times New Roman"/>
-        </w:rPr>
-        <w:t xml:space="preserve"> de dimensiones micrométricas, </w:t>
+        <w:t>probe-station</w:t>
+      </w:r>
+      <w:r>
+        <w:rPr>
+          <w:rFonts w:ascii="Times New Roman" w:hAnsi="Times New Roman" w:cs="Times New Roman"/>
+        </w:rPr>
+        <w:t xml:space="preserve">) con micromanipuladores que permiten realizar contacto eléctrico en los PADs de dimensiones micrométricas, </w:t>
       </w:r>
       <w:r>
         <w:rPr>
@@ -2564,21 +2464,7 @@
           <w:rFonts w:ascii="Times New Roman" w:hAnsi="Times New Roman" w:cs="Times New Roman"/>
         </w:rPr>
         <w:lastRenderedPageBreak/>
-        <w:t>probe-</w:t>
-      </w:r>
-      <w:proofErr w:type="spellStart"/>
-      <w:r>
-        <w:rPr>
-          <w:rFonts w:ascii="Times New Roman" w:hAnsi="Times New Roman" w:cs="Times New Roman"/>
-        </w:rPr>
-        <w:t>station</w:t>
-      </w:r>
-      <w:proofErr w:type="spellEnd"/>
-      <w:r>
-        <w:rPr>
-          <w:rFonts w:ascii="Times New Roman" w:hAnsi="Times New Roman" w:cs="Times New Roman"/>
-        </w:rPr>
-        <w:t xml:space="preserve"> se conecta a los instrumentos de medición, los cuales pueden ser controlados de forma manual o asistidos por computadora.</w:t>
+        <w:t>probe-station se conecta a los instrumentos de medición, los cuales pueden ser controlados de forma manual o asistidos por computadora.</w:t>
       </w:r>
       <w:r>
         <w:rPr>
@@ -2651,21 +2537,7 @@
         <w:rPr>
           <w:rFonts w:ascii="Times New Roman" w:hAnsi="Times New Roman" w:cs="Times New Roman"/>
         </w:rPr>
-        <w:t>donde se varía su geometría y la naturaleza del electrodo de inyección. Una vez dominado el proceso de inyección de carga, se deberá caracterizar la respuesta eléctrica corriente-tensión para distintos estados de carga de los dispositivos. Para estas experiencias el LFDM cuenta con instrumentos de medición como fuentes de tensión y electrómetros, todos ellos con conexión a la probe-</w:t>
-      </w:r>
-      <w:proofErr w:type="spellStart"/>
-      <w:r>
-        <w:rPr>
-          <w:rFonts w:ascii="Times New Roman" w:hAnsi="Times New Roman" w:cs="Times New Roman"/>
-        </w:rPr>
-        <w:t>station</w:t>
-      </w:r>
-      <w:proofErr w:type="spellEnd"/>
-      <w:r>
-        <w:rPr>
-          <w:rFonts w:ascii="Times New Roman" w:hAnsi="Times New Roman" w:cs="Times New Roman"/>
-        </w:rPr>
-        <w:t>.</w:t>
+        <w:t>donde se varía su geometría y la naturaleza del electrodo de inyección. Una vez dominado el proceso de inyección de carga, se deberá caracterizar la respuesta eléctrica corriente-tensión para distintos estados de carga de los dispositivos. Para estas experiencias el LFDM cuenta con instrumentos de medición como fuentes de tensión y electrómetros, todos ellos con conexión a la probe-station.</w:t>
       </w:r>
     </w:p>
     <w:p>
@@ -3382,7 +3254,6 @@
               <w:bottom w:val="single" w:sz="12" w:space="0" w:color="000001"/>
               <w:right w:val="single" w:sz="12" w:space="0" w:color="000001"/>
             </w:tcBorders>
-            <w:shd w:val="clear" w:color="auto" w:fill="auto"/>
             <w:vAlign w:val="center"/>
           </w:tcPr>
           <w:p>
@@ -3454,7 +3325,6 @@
               <w:bottom w:val="single" w:sz="12" w:space="0" w:color="000001"/>
               <w:right w:val="single" w:sz="12" w:space="0" w:color="000001"/>
             </w:tcBorders>
-            <w:shd w:val="clear" w:color="auto" w:fill="auto"/>
             <w:vAlign w:val="center"/>
           </w:tcPr>
           <w:p>
@@ -3479,7 +3349,6 @@
               <w:bottom w:val="single" w:sz="12" w:space="0" w:color="000001"/>
               <w:right w:val="single" w:sz="4" w:space="0" w:color="000001"/>
             </w:tcBorders>
-            <w:shd w:val="clear" w:color="auto" w:fill="auto"/>
             <w:vAlign w:val="center"/>
           </w:tcPr>
           <w:p>
@@ -3508,7 +3377,6 @@
               <w:bottom w:val="single" w:sz="12" w:space="0" w:color="000001"/>
               <w:right w:val="single" w:sz="4" w:space="0" w:color="000001"/>
             </w:tcBorders>
-            <w:shd w:val="clear" w:color="auto" w:fill="auto"/>
             <w:tcMar>
               <w:left w:w="40" w:type="dxa"/>
             </w:tcMar>
@@ -3540,7 +3408,6 @@
               <w:bottom w:val="single" w:sz="12" w:space="0" w:color="000001"/>
               <w:right w:val="single" w:sz="4" w:space="0" w:color="000001"/>
             </w:tcBorders>
-            <w:shd w:val="clear" w:color="auto" w:fill="auto"/>
             <w:tcMar>
               <w:left w:w="40" w:type="dxa"/>
             </w:tcMar>
@@ -3572,7 +3439,6 @@
               <w:bottom w:val="single" w:sz="12" w:space="0" w:color="000001"/>
               <w:right w:val="single" w:sz="4" w:space="0" w:color="000001"/>
             </w:tcBorders>
-            <w:shd w:val="clear" w:color="auto" w:fill="auto"/>
             <w:tcMar>
               <w:left w:w="40" w:type="dxa"/>
             </w:tcMar>
@@ -3604,7 +3470,6 @@
               <w:bottom w:val="single" w:sz="12" w:space="0" w:color="000001"/>
               <w:right w:val="single" w:sz="4" w:space="0" w:color="000001"/>
             </w:tcBorders>
-            <w:shd w:val="clear" w:color="auto" w:fill="auto"/>
             <w:tcMar>
               <w:left w:w="40" w:type="dxa"/>
             </w:tcMar>
@@ -3636,7 +3501,6 @@
               <w:bottom w:val="single" w:sz="12" w:space="0" w:color="000001"/>
               <w:right w:val="single" w:sz="4" w:space="0" w:color="000001"/>
             </w:tcBorders>
-            <w:shd w:val="clear" w:color="auto" w:fill="auto"/>
             <w:tcMar>
               <w:left w:w="40" w:type="dxa"/>
             </w:tcMar>
@@ -3668,7 +3532,6 @@
               <w:bottom w:val="single" w:sz="12" w:space="0" w:color="000001"/>
               <w:right w:val="single" w:sz="4" w:space="0" w:color="000001"/>
             </w:tcBorders>
-            <w:shd w:val="clear" w:color="auto" w:fill="auto"/>
             <w:tcMar>
               <w:left w:w="40" w:type="dxa"/>
             </w:tcMar>
@@ -3700,7 +3563,6 @@
               <w:bottom w:val="single" w:sz="12" w:space="0" w:color="000001"/>
               <w:right w:val="single" w:sz="4" w:space="0" w:color="000001"/>
             </w:tcBorders>
-            <w:shd w:val="clear" w:color="auto" w:fill="auto"/>
             <w:tcMar>
               <w:left w:w="40" w:type="dxa"/>
             </w:tcMar>
@@ -3732,7 +3594,6 @@
               <w:bottom w:val="single" w:sz="12" w:space="0" w:color="000001"/>
               <w:right w:val="single" w:sz="4" w:space="0" w:color="000001"/>
             </w:tcBorders>
-            <w:shd w:val="clear" w:color="auto" w:fill="auto"/>
             <w:tcMar>
               <w:left w:w="40" w:type="dxa"/>
             </w:tcMar>
@@ -3764,7 +3625,6 @@
               <w:bottom w:val="single" w:sz="12" w:space="0" w:color="000001"/>
               <w:right w:val="single" w:sz="4" w:space="0" w:color="000001"/>
             </w:tcBorders>
-            <w:shd w:val="clear" w:color="auto" w:fill="auto"/>
             <w:tcMar>
               <w:left w:w="40" w:type="dxa"/>
             </w:tcMar>
@@ -3796,7 +3656,6 @@
               <w:bottom w:val="single" w:sz="12" w:space="0" w:color="000001"/>
               <w:right w:val="single" w:sz="4" w:space="0" w:color="000001"/>
             </w:tcBorders>
-            <w:shd w:val="clear" w:color="auto" w:fill="auto"/>
             <w:tcMar>
               <w:left w:w="40" w:type="dxa"/>
             </w:tcMar>
@@ -3828,7 +3687,6 @@
               <w:bottom w:val="single" w:sz="12" w:space="0" w:color="000001"/>
               <w:right w:val="single" w:sz="12" w:space="0" w:color="000001"/>
             </w:tcBorders>
-            <w:shd w:val="clear" w:color="auto" w:fill="auto"/>
             <w:tcMar>
               <w:left w:w="40" w:type="dxa"/>
             </w:tcMar>
@@ -3866,7 +3724,6 @@
               <w:bottom w:val="single" w:sz="12" w:space="0" w:color="000001"/>
               <w:right w:val="single" w:sz="12" w:space="0" w:color="000001"/>
             </w:tcBorders>
-            <w:shd w:val="clear" w:color="auto" w:fill="auto"/>
             <w:vAlign w:val="center"/>
           </w:tcPr>
           <w:p>
@@ -3895,7 +3752,6 @@
               <w:bottom w:val="single" w:sz="12" w:space="0" w:color="000001"/>
               <w:right w:val="single" w:sz="4" w:space="0" w:color="000001"/>
             </w:tcBorders>
-            <w:shd w:val="clear" w:color="auto" w:fill="auto"/>
             <w:vAlign w:val="center"/>
           </w:tcPr>
           <w:p>
@@ -3924,7 +3780,6 @@
               <w:bottom w:val="single" w:sz="12" w:space="0" w:color="000001"/>
               <w:right w:val="single" w:sz="4" w:space="0" w:color="000001"/>
             </w:tcBorders>
-            <w:shd w:val="clear" w:color="auto" w:fill="auto"/>
             <w:tcMar>
               <w:left w:w="40" w:type="dxa"/>
             </w:tcMar>
@@ -3956,7 +3811,6 @@
               <w:bottom w:val="single" w:sz="12" w:space="0" w:color="000001"/>
               <w:right w:val="single" w:sz="4" w:space="0" w:color="000001"/>
             </w:tcBorders>
-            <w:shd w:val="clear" w:color="auto" w:fill="auto"/>
             <w:tcMar>
               <w:left w:w="40" w:type="dxa"/>
             </w:tcMar>
@@ -3988,7 +3842,6 @@
               <w:bottom w:val="single" w:sz="12" w:space="0" w:color="000001"/>
               <w:right w:val="single" w:sz="4" w:space="0" w:color="000001"/>
             </w:tcBorders>
-            <w:shd w:val="clear" w:color="auto" w:fill="auto"/>
             <w:tcMar>
               <w:left w:w="40" w:type="dxa"/>
             </w:tcMar>
@@ -4014,7 +3867,6 @@
               <w:bottom w:val="single" w:sz="12" w:space="0" w:color="000001"/>
               <w:right w:val="single" w:sz="4" w:space="0" w:color="000001"/>
             </w:tcBorders>
-            <w:shd w:val="clear" w:color="auto" w:fill="auto"/>
             <w:tcMar>
               <w:left w:w="40" w:type="dxa"/>
             </w:tcMar>
@@ -4040,7 +3892,6 @@
               <w:bottom w:val="single" w:sz="12" w:space="0" w:color="000001"/>
               <w:right w:val="single" w:sz="4" w:space="0" w:color="000001"/>
             </w:tcBorders>
-            <w:shd w:val="clear" w:color="auto" w:fill="auto"/>
             <w:tcMar>
               <w:left w:w="40" w:type="dxa"/>
             </w:tcMar>
@@ -4066,7 +3917,6 @@
               <w:bottom w:val="single" w:sz="12" w:space="0" w:color="000001"/>
               <w:right w:val="single" w:sz="4" w:space="0" w:color="000001"/>
             </w:tcBorders>
-            <w:shd w:val="clear" w:color="auto" w:fill="auto"/>
             <w:tcMar>
               <w:left w:w="40" w:type="dxa"/>
             </w:tcMar>
@@ -4092,7 +3942,6 @@
               <w:bottom w:val="single" w:sz="12" w:space="0" w:color="000001"/>
               <w:right w:val="single" w:sz="4" w:space="0" w:color="000001"/>
             </w:tcBorders>
-            <w:shd w:val="clear" w:color="auto" w:fill="auto"/>
             <w:tcMar>
               <w:left w:w="40" w:type="dxa"/>
             </w:tcMar>
@@ -4124,7 +3973,6 @@
               <w:bottom w:val="single" w:sz="12" w:space="0" w:color="000001"/>
               <w:right w:val="single" w:sz="4" w:space="0" w:color="000001"/>
             </w:tcBorders>
-            <w:shd w:val="clear" w:color="auto" w:fill="auto"/>
             <w:tcMar>
               <w:left w:w="40" w:type="dxa"/>
             </w:tcMar>
@@ -4156,7 +4004,6 @@
               <w:bottom w:val="single" w:sz="12" w:space="0" w:color="000001"/>
               <w:right w:val="single" w:sz="4" w:space="0" w:color="000001"/>
             </w:tcBorders>
-            <w:shd w:val="clear" w:color="auto" w:fill="auto"/>
             <w:tcMar>
               <w:left w:w="40" w:type="dxa"/>
             </w:tcMar>
@@ -4182,7 +4029,6 @@
               <w:bottom w:val="single" w:sz="12" w:space="0" w:color="000001"/>
               <w:right w:val="single" w:sz="4" w:space="0" w:color="000001"/>
             </w:tcBorders>
-            <w:shd w:val="clear" w:color="auto" w:fill="auto"/>
             <w:tcMar>
               <w:left w:w="40" w:type="dxa"/>
             </w:tcMar>
@@ -4208,7 +4054,6 @@
               <w:bottom w:val="single" w:sz="12" w:space="0" w:color="000001"/>
               <w:right w:val="single" w:sz="12" w:space="0" w:color="000001"/>
             </w:tcBorders>
-            <w:shd w:val="clear" w:color="auto" w:fill="auto"/>
             <w:tcMar>
               <w:left w:w="40" w:type="dxa"/>
             </w:tcMar>
@@ -4240,7 +4085,6 @@
               <w:bottom w:val="single" w:sz="12" w:space="0" w:color="000001"/>
               <w:right w:val="single" w:sz="12" w:space="0" w:color="000001"/>
             </w:tcBorders>
-            <w:shd w:val="clear" w:color="auto" w:fill="auto"/>
             <w:vAlign w:val="center"/>
           </w:tcPr>
           <w:p>
@@ -4269,7 +4113,6 @@
               <w:bottom w:val="single" w:sz="12" w:space="0" w:color="000001"/>
               <w:right w:val="single" w:sz="4" w:space="0" w:color="000001"/>
             </w:tcBorders>
-            <w:shd w:val="clear" w:color="auto" w:fill="auto"/>
             <w:vAlign w:val="center"/>
           </w:tcPr>
           <w:p>
@@ -4298,7 +4141,6 @@
               <w:bottom w:val="single" w:sz="12" w:space="0" w:color="000001"/>
               <w:right w:val="single" w:sz="4" w:space="0" w:color="000001"/>
             </w:tcBorders>
-            <w:shd w:val="clear" w:color="auto" w:fill="auto"/>
             <w:tcMar>
               <w:left w:w="40" w:type="dxa"/>
             </w:tcMar>
@@ -4330,7 +4172,6 @@
               <w:bottom w:val="single" w:sz="12" w:space="0" w:color="000001"/>
               <w:right w:val="single" w:sz="4" w:space="0" w:color="000001"/>
             </w:tcBorders>
-            <w:shd w:val="clear" w:color="auto" w:fill="auto"/>
             <w:tcMar>
               <w:left w:w="40" w:type="dxa"/>
             </w:tcMar>
@@ -4362,7 +4203,6 @@
               <w:bottom w:val="single" w:sz="12" w:space="0" w:color="000001"/>
               <w:right w:val="single" w:sz="4" w:space="0" w:color="000001"/>
             </w:tcBorders>
-            <w:shd w:val="clear" w:color="auto" w:fill="auto"/>
             <w:tcMar>
               <w:left w:w="40" w:type="dxa"/>
             </w:tcMar>
@@ -4394,7 +4234,6 @@
               <w:bottom w:val="single" w:sz="12" w:space="0" w:color="000001"/>
               <w:right w:val="single" w:sz="4" w:space="0" w:color="000001"/>
             </w:tcBorders>
-            <w:shd w:val="clear" w:color="auto" w:fill="auto"/>
             <w:tcMar>
               <w:left w:w="40" w:type="dxa"/>
             </w:tcMar>
@@ -4420,7 +4259,6 @@
               <w:bottom w:val="single" w:sz="12" w:space="0" w:color="000001"/>
               <w:right w:val="single" w:sz="4" w:space="0" w:color="000001"/>
             </w:tcBorders>
-            <w:shd w:val="clear" w:color="auto" w:fill="auto"/>
             <w:tcMar>
               <w:left w:w="40" w:type="dxa"/>
             </w:tcMar>
@@ -4446,7 +4284,6 @@
               <w:bottom w:val="single" w:sz="12" w:space="0" w:color="000001"/>
               <w:right w:val="single" w:sz="4" w:space="0" w:color="000001"/>
             </w:tcBorders>
-            <w:shd w:val="clear" w:color="auto" w:fill="auto"/>
             <w:tcMar>
               <w:left w:w="40" w:type="dxa"/>
             </w:tcMar>
@@ -4472,7 +4309,6 @@
               <w:bottom w:val="single" w:sz="12" w:space="0" w:color="000001"/>
               <w:right w:val="single" w:sz="4" w:space="0" w:color="000001"/>
             </w:tcBorders>
-            <w:shd w:val="clear" w:color="auto" w:fill="auto"/>
             <w:tcMar>
               <w:left w:w="40" w:type="dxa"/>
             </w:tcMar>
@@ -4498,7 +4334,6 @@
               <w:bottom w:val="single" w:sz="12" w:space="0" w:color="000001"/>
               <w:right w:val="single" w:sz="4" w:space="0" w:color="000001"/>
             </w:tcBorders>
-            <w:shd w:val="clear" w:color="auto" w:fill="auto"/>
             <w:tcMar>
               <w:left w:w="40" w:type="dxa"/>
             </w:tcMar>
@@ -4524,7 +4359,6 @@
               <w:bottom w:val="single" w:sz="12" w:space="0" w:color="000001"/>
               <w:right w:val="single" w:sz="4" w:space="0" w:color="000001"/>
             </w:tcBorders>
-            <w:shd w:val="clear" w:color="auto" w:fill="auto"/>
             <w:tcMar>
               <w:left w:w="40" w:type="dxa"/>
             </w:tcMar>
@@ -4550,7 +4384,6 @@
               <w:bottom w:val="single" w:sz="12" w:space="0" w:color="000001"/>
               <w:right w:val="single" w:sz="4" w:space="0" w:color="000001"/>
             </w:tcBorders>
-            <w:shd w:val="clear" w:color="auto" w:fill="auto"/>
             <w:tcMar>
               <w:left w:w="40" w:type="dxa"/>
             </w:tcMar>
@@ -4576,7 +4409,6 @@
               <w:bottom w:val="single" w:sz="12" w:space="0" w:color="000001"/>
               <w:right w:val="single" w:sz="12" w:space="0" w:color="000001"/>
             </w:tcBorders>
-            <w:shd w:val="clear" w:color="auto" w:fill="auto"/>
             <w:tcMar>
               <w:left w:w="40" w:type="dxa"/>
             </w:tcMar>
@@ -4608,7 +4440,6 @@
               <w:bottom w:val="single" w:sz="12" w:space="0" w:color="000001"/>
               <w:right w:val="single" w:sz="12" w:space="0" w:color="000001"/>
             </w:tcBorders>
-            <w:shd w:val="clear" w:color="auto" w:fill="auto"/>
             <w:vAlign w:val="center"/>
           </w:tcPr>
           <w:p>
@@ -4637,7 +4468,6 @@
               <w:bottom w:val="single" w:sz="12" w:space="0" w:color="000001"/>
               <w:right w:val="single" w:sz="12" w:space="0" w:color="000001"/>
             </w:tcBorders>
-            <w:shd w:val="clear" w:color="auto" w:fill="auto"/>
             <w:tcMar>
               <w:right w:w="0" w:type="dxa"/>
             </w:tcMar>
@@ -4663,7 +4493,6 @@
               <w:bottom w:val="single" w:sz="12" w:space="0" w:color="000001"/>
               <w:right w:val="single" w:sz="12" w:space="0" w:color="000001"/>
             </w:tcBorders>
-            <w:shd w:val="clear" w:color="auto" w:fill="auto"/>
             <w:tcMar>
               <w:right w:w="0" w:type="dxa"/>
             </w:tcMar>
@@ -4689,7 +4518,6 @@
               <w:bottom w:val="single" w:sz="12" w:space="0" w:color="000001"/>
               <w:right w:val="single" w:sz="12" w:space="0" w:color="000001"/>
             </w:tcBorders>
-            <w:shd w:val="clear" w:color="auto" w:fill="auto"/>
             <w:tcMar>
               <w:right w:w="0" w:type="dxa"/>
             </w:tcMar>
@@ -4721,7 +4549,6 @@
               <w:bottom w:val="single" w:sz="12" w:space="0" w:color="000001"/>
               <w:right w:val="single" w:sz="12" w:space="0" w:color="000001"/>
             </w:tcBorders>
-            <w:shd w:val="clear" w:color="auto" w:fill="auto"/>
             <w:tcMar>
               <w:right w:w="0" w:type="dxa"/>
             </w:tcMar>
@@ -4753,7 +4580,6 @@
               <w:bottom w:val="single" w:sz="12" w:space="0" w:color="000001"/>
               <w:right w:val="single" w:sz="12" w:space="0" w:color="000001"/>
             </w:tcBorders>
-            <w:shd w:val="clear" w:color="auto" w:fill="auto"/>
             <w:tcMar>
               <w:right w:w="0" w:type="dxa"/>
             </w:tcMar>
@@ -4785,7 +4611,6 @@
               <w:bottom w:val="single" w:sz="12" w:space="0" w:color="000001"/>
               <w:right w:val="single" w:sz="12" w:space="0" w:color="000001"/>
             </w:tcBorders>
-            <w:shd w:val="clear" w:color="auto" w:fill="auto"/>
             <w:tcMar>
               <w:right w:w="0" w:type="dxa"/>
             </w:tcMar>
@@ -4811,7 +4636,6 @@
               <w:bottom w:val="single" w:sz="12" w:space="0" w:color="000001"/>
               <w:right w:val="single" w:sz="12" w:space="0" w:color="000001"/>
             </w:tcBorders>
-            <w:shd w:val="clear" w:color="auto" w:fill="auto"/>
             <w:tcMar>
               <w:right w:w="0" w:type="dxa"/>
             </w:tcMar>
@@ -4837,7 +4661,6 @@
               <w:bottom w:val="single" w:sz="12" w:space="0" w:color="000001"/>
               <w:right w:val="single" w:sz="12" w:space="0" w:color="000001"/>
             </w:tcBorders>
-            <w:shd w:val="clear" w:color="auto" w:fill="auto"/>
             <w:tcMar>
               <w:right w:w="0" w:type="dxa"/>
             </w:tcMar>
@@ -4869,7 +4692,6 @@
               <w:bottom w:val="single" w:sz="12" w:space="0" w:color="000001"/>
               <w:right w:val="single" w:sz="12" w:space="0" w:color="000001"/>
             </w:tcBorders>
-            <w:shd w:val="clear" w:color="auto" w:fill="auto"/>
             <w:tcMar>
               <w:right w:w="0" w:type="dxa"/>
             </w:tcMar>
@@ -4901,7 +4723,6 @@
               <w:bottom w:val="single" w:sz="12" w:space="0" w:color="000001"/>
               <w:right w:val="single" w:sz="12" w:space="0" w:color="000001"/>
             </w:tcBorders>
-            <w:shd w:val="clear" w:color="auto" w:fill="auto"/>
             <w:tcMar>
               <w:right w:w="0" w:type="dxa"/>
             </w:tcMar>
@@ -4927,7 +4748,6 @@
               <w:bottom w:val="single" w:sz="12" w:space="0" w:color="000001"/>
               <w:right w:val="single" w:sz="12" w:space="0" w:color="000001"/>
             </w:tcBorders>
-            <w:shd w:val="clear" w:color="auto" w:fill="auto"/>
             <w:tcMar>
               <w:right w:w="0" w:type="dxa"/>
             </w:tcMar>
@@ -4953,7 +4773,6 @@
               <w:bottom w:val="single" w:sz="12" w:space="0" w:color="000001"/>
               <w:right w:val="single" w:sz="12" w:space="0" w:color="000001"/>
             </w:tcBorders>
-            <w:shd w:val="clear" w:color="auto" w:fill="auto"/>
             <w:tcMar>
               <w:right w:w="0" w:type="dxa"/>
             </w:tcMar>
@@ -4985,7 +4804,6 @@
               <w:bottom w:val="single" w:sz="12" w:space="0" w:color="000001"/>
               <w:right w:val="single" w:sz="12" w:space="0" w:color="000001"/>
             </w:tcBorders>
-            <w:shd w:val="clear" w:color="auto" w:fill="auto"/>
             <w:vAlign w:val="center"/>
           </w:tcPr>
           <w:p>
@@ -5014,7 +4832,6 @@
               <w:bottom w:val="single" w:sz="12" w:space="0" w:color="000001"/>
               <w:right w:val="single" w:sz="12" w:space="0" w:color="000001"/>
             </w:tcBorders>
-            <w:shd w:val="clear" w:color="auto" w:fill="auto"/>
             <w:tcMar>
               <w:right w:w="0" w:type="dxa"/>
             </w:tcMar>
@@ -5040,7 +4857,6 @@
               <w:bottom w:val="single" w:sz="12" w:space="0" w:color="000001"/>
               <w:right w:val="single" w:sz="12" w:space="0" w:color="000001"/>
             </w:tcBorders>
-            <w:shd w:val="clear" w:color="auto" w:fill="auto"/>
             <w:tcMar>
               <w:right w:w="0" w:type="dxa"/>
             </w:tcMar>
@@ -5066,7 +4882,6 @@
               <w:bottom w:val="single" w:sz="12" w:space="0" w:color="000001"/>
               <w:right w:val="single" w:sz="12" w:space="0" w:color="000001"/>
             </w:tcBorders>
-            <w:shd w:val="clear" w:color="auto" w:fill="auto"/>
             <w:tcMar>
               <w:right w:w="0" w:type="dxa"/>
             </w:tcMar>
@@ -5098,7 +4913,6 @@
               <w:bottom w:val="single" w:sz="12" w:space="0" w:color="000001"/>
               <w:right w:val="single" w:sz="12" w:space="0" w:color="000001"/>
             </w:tcBorders>
-            <w:shd w:val="clear" w:color="auto" w:fill="auto"/>
             <w:tcMar>
               <w:right w:w="0" w:type="dxa"/>
             </w:tcMar>
@@ -5130,7 +4944,6 @@
               <w:bottom w:val="single" w:sz="12" w:space="0" w:color="000001"/>
               <w:right w:val="single" w:sz="12" w:space="0" w:color="000001"/>
             </w:tcBorders>
-            <w:shd w:val="clear" w:color="auto" w:fill="auto"/>
             <w:tcMar>
               <w:right w:w="0" w:type="dxa"/>
             </w:tcMar>
@@ -5162,7 +4975,6 @@
               <w:bottom w:val="single" w:sz="12" w:space="0" w:color="000001"/>
               <w:right w:val="single" w:sz="12" w:space="0" w:color="000001"/>
             </w:tcBorders>
-            <w:shd w:val="clear" w:color="auto" w:fill="auto"/>
             <w:tcMar>
               <w:right w:w="0" w:type="dxa"/>
             </w:tcMar>
@@ -5194,7 +5006,6 @@
               <w:bottom w:val="single" w:sz="12" w:space="0" w:color="000001"/>
               <w:right w:val="single" w:sz="12" w:space="0" w:color="000001"/>
             </w:tcBorders>
-            <w:shd w:val="clear" w:color="auto" w:fill="auto"/>
             <w:tcMar>
               <w:right w:w="0" w:type="dxa"/>
             </w:tcMar>
@@ -5226,7 +5037,6 @@
               <w:bottom w:val="single" w:sz="12" w:space="0" w:color="000001"/>
               <w:right w:val="single" w:sz="12" w:space="0" w:color="000001"/>
             </w:tcBorders>
-            <w:shd w:val="clear" w:color="auto" w:fill="auto"/>
             <w:tcMar>
               <w:right w:w="0" w:type="dxa"/>
             </w:tcMar>
@@ -5258,7 +5068,6 @@
               <w:bottom w:val="single" w:sz="12" w:space="0" w:color="000001"/>
               <w:right w:val="single" w:sz="12" w:space="0" w:color="000001"/>
             </w:tcBorders>
-            <w:shd w:val="clear" w:color="auto" w:fill="auto"/>
             <w:tcMar>
               <w:right w:w="0" w:type="dxa"/>
             </w:tcMar>
@@ -5290,7 +5099,6 @@
               <w:bottom w:val="single" w:sz="12" w:space="0" w:color="000001"/>
               <w:right w:val="single" w:sz="12" w:space="0" w:color="000001"/>
             </w:tcBorders>
-            <w:shd w:val="clear" w:color="auto" w:fill="auto"/>
             <w:tcMar>
               <w:right w:w="0" w:type="dxa"/>
             </w:tcMar>
@@ -5322,7 +5130,6 @@
               <w:bottom w:val="single" w:sz="12" w:space="0" w:color="000001"/>
               <w:right w:val="single" w:sz="12" w:space="0" w:color="000001"/>
             </w:tcBorders>
-            <w:shd w:val="clear" w:color="auto" w:fill="auto"/>
             <w:tcMar>
               <w:right w:w="0" w:type="dxa"/>
             </w:tcMar>
@@ -5348,7 +5155,6 @@
               <w:bottom w:val="single" w:sz="12" w:space="0" w:color="000001"/>
               <w:right w:val="single" w:sz="12" w:space="0" w:color="000001"/>
             </w:tcBorders>
-            <w:shd w:val="clear" w:color="auto" w:fill="auto"/>
             <w:tcMar>
               <w:right w:w="0" w:type="dxa"/>
             </w:tcMar>
@@ -5380,7 +5186,6 @@
               <w:bottom w:val="single" w:sz="12" w:space="0" w:color="000001"/>
               <w:right w:val="single" w:sz="12" w:space="0" w:color="000001"/>
             </w:tcBorders>
-            <w:shd w:val="clear" w:color="auto" w:fill="auto"/>
             <w:vAlign w:val="center"/>
           </w:tcPr>
           <w:p>
@@ -5421,7 +5226,6 @@
               <w:bottom w:val="single" w:sz="12" w:space="0" w:color="000001"/>
               <w:right w:val="single" w:sz="12" w:space="0" w:color="000001"/>
             </w:tcBorders>
-            <w:shd w:val="clear" w:color="auto" w:fill="auto"/>
             <w:tcMar>
               <w:right w:w="0" w:type="dxa"/>
             </w:tcMar>
@@ -5447,7 +5251,6 @@
               <w:bottom w:val="single" w:sz="12" w:space="0" w:color="000001"/>
               <w:right w:val="single" w:sz="12" w:space="0" w:color="000001"/>
             </w:tcBorders>
-            <w:shd w:val="clear" w:color="auto" w:fill="auto"/>
             <w:tcMar>
               <w:right w:w="0" w:type="dxa"/>
             </w:tcMar>
@@ -5473,7 +5276,6 @@
               <w:bottom w:val="single" w:sz="12" w:space="0" w:color="000001"/>
               <w:right w:val="single" w:sz="12" w:space="0" w:color="000001"/>
             </w:tcBorders>
-            <w:shd w:val="clear" w:color="auto" w:fill="auto"/>
             <w:tcMar>
               <w:right w:w="0" w:type="dxa"/>
             </w:tcMar>
@@ -5499,7 +5301,6 @@
               <w:bottom w:val="single" w:sz="12" w:space="0" w:color="000001"/>
               <w:right w:val="single" w:sz="12" w:space="0" w:color="000001"/>
             </w:tcBorders>
-            <w:shd w:val="clear" w:color="auto" w:fill="auto"/>
             <w:tcMar>
               <w:right w:w="0" w:type="dxa"/>
             </w:tcMar>
@@ -5525,7 +5326,6 @@
               <w:bottom w:val="single" w:sz="12" w:space="0" w:color="000001"/>
               <w:right w:val="single" w:sz="12" w:space="0" w:color="000001"/>
             </w:tcBorders>
-            <w:shd w:val="clear" w:color="auto" w:fill="auto"/>
             <w:tcMar>
               <w:right w:w="0" w:type="dxa"/>
             </w:tcMar>
@@ -5557,7 +5357,6 @@
               <w:bottom w:val="single" w:sz="12" w:space="0" w:color="000001"/>
               <w:right w:val="single" w:sz="12" w:space="0" w:color="000001"/>
             </w:tcBorders>
-            <w:shd w:val="clear" w:color="auto" w:fill="auto"/>
             <w:tcMar>
               <w:right w:w="0" w:type="dxa"/>
             </w:tcMar>
@@ -5589,7 +5388,6 @@
               <w:bottom w:val="single" w:sz="12" w:space="0" w:color="000001"/>
               <w:right w:val="single" w:sz="12" w:space="0" w:color="000001"/>
             </w:tcBorders>
-            <w:shd w:val="clear" w:color="auto" w:fill="auto"/>
             <w:tcMar>
               <w:right w:w="0" w:type="dxa"/>
             </w:tcMar>
@@ -5621,7 +5419,6 @@
               <w:bottom w:val="single" w:sz="12" w:space="0" w:color="000001"/>
               <w:right w:val="single" w:sz="12" w:space="0" w:color="000001"/>
             </w:tcBorders>
-            <w:shd w:val="clear" w:color="auto" w:fill="auto"/>
             <w:tcMar>
               <w:right w:w="0" w:type="dxa"/>
             </w:tcMar>
@@ -5653,7 +5450,6 @@
               <w:bottom w:val="single" w:sz="12" w:space="0" w:color="000001"/>
               <w:right w:val="single" w:sz="12" w:space="0" w:color="000001"/>
             </w:tcBorders>
-            <w:shd w:val="clear" w:color="auto" w:fill="auto"/>
             <w:tcMar>
               <w:right w:w="0" w:type="dxa"/>
             </w:tcMar>
@@ -5685,7 +5481,6 @@
               <w:bottom w:val="single" w:sz="12" w:space="0" w:color="000001"/>
               <w:right w:val="single" w:sz="12" w:space="0" w:color="000001"/>
             </w:tcBorders>
-            <w:shd w:val="clear" w:color="auto" w:fill="auto"/>
             <w:tcMar>
               <w:right w:w="0" w:type="dxa"/>
             </w:tcMar>
@@ -5717,7 +5512,6 @@
               <w:bottom w:val="single" w:sz="12" w:space="0" w:color="000001"/>
               <w:right w:val="single" w:sz="12" w:space="0" w:color="000001"/>
             </w:tcBorders>
-            <w:shd w:val="clear" w:color="auto" w:fill="auto"/>
             <w:tcMar>
               <w:right w:w="0" w:type="dxa"/>
             </w:tcMar>
@@ -5743,7 +5537,6 @@
               <w:bottom w:val="single" w:sz="12" w:space="0" w:color="000001"/>
               <w:right w:val="single" w:sz="12" w:space="0" w:color="000001"/>
             </w:tcBorders>
-            <w:shd w:val="clear" w:color="auto" w:fill="auto"/>
             <w:tcMar>
               <w:right w:w="0" w:type="dxa"/>
             </w:tcMar>
@@ -5775,7 +5568,6 @@
               <w:bottom w:val="single" w:sz="12" w:space="0" w:color="000001"/>
               <w:right w:val="single" w:sz="12" w:space="0" w:color="000001"/>
             </w:tcBorders>
-            <w:shd w:val="clear" w:color="auto" w:fill="auto"/>
             <w:tcMar>
               <w:right w:w="0" w:type="dxa"/>
             </w:tcMar>
@@ -5807,7 +5599,6 @@
               <w:bottom w:val="single" w:sz="12" w:space="0" w:color="000001"/>
               <w:right w:val="single" w:sz="12" w:space="0" w:color="000001"/>
             </w:tcBorders>
-            <w:shd w:val="clear" w:color="auto" w:fill="auto"/>
             <w:tcMar>
               <w:right w:w="0" w:type="dxa"/>
             </w:tcMar>
@@ -5833,7 +5624,6 @@
               <w:bottom w:val="single" w:sz="12" w:space="0" w:color="000001"/>
               <w:right w:val="single" w:sz="12" w:space="0" w:color="000001"/>
             </w:tcBorders>
-            <w:shd w:val="clear" w:color="auto" w:fill="auto"/>
             <w:tcMar>
               <w:right w:w="0" w:type="dxa"/>
             </w:tcMar>
@@ -5859,7 +5649,6 @@
               <w:bottom w:val="single" w:sz="12" w:space="0" w:color="000001"/>
               <w:right w:val="single" w:sz="12" w:space="0" w:color="000001"/>
             </w:tcBorders>
-            <w:shd w:val="clear" w:color="auto" w:fill="auto"/>
             <w:tcMar>
               <w:right w:w="0" w:type="dxa"/>
             </w:tcMar>
@@ -5885,7 +5674,6 @@
               <w:bottom w:val="single" w:sz="12" w:space="0" w:color="000001"/>
               <w:right w:val="single" w:sz="12" w:space="0" w:color="000001"/>
             </w:tcBorders>
-            <w:shd w:val="clear" w:color="auto" w:fill="auto"/>
             <w:tcMar>
               <w:right w:w="0" w:type="dxa"/>
             </w:tcMar>
@@ -5911,7 +5699,6 @@
               <w:bottom w:val="single" w:sz="12" w:space="0" w:color="000001"/>
               <w:right w:val="single" w:sz="12" w:space="0" w:color="000001"/>
             </w:tcBorders>
-            <w:shd w:val="clear" w:color="auto" w:fill="auto"/>
             <w:tcMar>
               <w:right w:w="0" w:type="dxa"/>
             </w:tcMar>
@@ -5937,7 +5724,6 @@
               <w:bottom w:val="single" w:sz="12" w:space="0" w:color="000001"/>
               <w:right w:val="single" w:sz="12" w:space="0" w:color="000001"/>
             </w:tcBorders>
-            <w:shd w:val="clear" w:color="auto" w:fill="auto"/>
             <w:tcMar>
               <w:right w:w="0" w:type="dxa"/>
             </w:tcMar>
@@ -5963,7 +5749,6 @@
               <w:bottom w:val="single" w:sz="12" w:space="0" w:color="000001"/>
               <w:right w:val="single" w:sz="12" w:space="0" w:color="000001"/>
             </w:tcBorders>
-            <w:shd w:val="clear" w:color="auto" w:fill="auto"/>
             <w:tcMar>
               <w:right w:w="0" w:type="dxa"/>
             </w:tcMar>
@@ -5995,7 +5780,6 @@
               <w:bottom w:val="single" w:sz="12" w:space="0" w:color="000001"/>
               <w:right w:val="single" w:sz="12" w:space="0" w:color="000001"/>
             </w:tcBorders>
-            <w:shd w:val="clear" w:color="auto" w:fill="auto"/>
             <w:tcMar>
               <w:right w:w="0" w:type="dxa"/>
             </w:tcMar>
@@ -6027,7 +5811,6 @@
               <w:bottom w:val="single" w:sz="12" w:space="0" w:color="000001"/>
               <w:right w:val="single" w:sz="12" w:space="0" w:color="000001"/>
             </w:tcBorders>
-            <w:shd w:val="clear" w:color="auto" w:fill="auto"/>
             <w:tcMar>
               <w:right w:w="0" w:type="dxa"/>
             </w:tcMar>
@@ -6059,7 +5842,6 @@
               <w:bottom w:val="single" w:sz="12" w:space="0" w:color="000001"/>
               <w:right w:val="single" w:sz="12" w:space="0" w:color="000001"/>
             </w:tcBorders>
-            <w:shd w:val="clear" w:color="auto" w:fill="auto"/>
             <w:tcMar>
               <w:right w:w="0" w:type="dxa"/>
             </w:tcMar>
@@ -6091,7 +5873,6 @@
               <w:bottom w:val="single" w:sz="12" w:space="0" w:color="000001"/>
               <w:right w:val="single" w:sz="12" w:space="0" w:color="000001"/>
             </w:tcBorders>
-            <w:shd w:val="clear" w:color="auto" w:fill="auto"/>
             <w:tcMar>
               <w:right w:w="0" w:type="dxa"/>
             </w:tcMar>
@@ -6117,7 +5898,6 @@
               <w:bottom w:val="single" w:sz="12" w:space="0" w:color="000001"/>
               <w:right w:val="single" w:sz="12" w:space="0" w:color="000001"/>
             </w:tcBorders>
-            <w:shd w:val="clear" w:color="auto" w:fill="auto"/>
             <w:tcMar>
               <w:right w:w="0" w:type="dxa"/>
             </w:tcMar>
@@ -6149,7 +5929,6 @@
               <w:bottom w:val="single" w:sz="12" w:space="0" w:color="000001"/>
               <w:right w:val="single" w:sz="12" w:space="0" w:color="000001"/>
             </w:tcBorders>
-            <w:shd w:val="clear" w:color="auto" w:fill="auto"/>
             <w:tcMar>
               <w:right w:w="0" w:type="dxa"/>
             </w:tcMar>
@@ -6181,7 +5960,6 @@
               <w:bottom w:val="single" w:sz="12" w:space="0" w:color="000001"/>
               <w:right w:val="single" w:sz="12" w:space="0" w:color="000001"/>
             </w:tcBorders>
-            <w:shd w:val="clear" w:color="auto" w:fill="auto"/>
             <w:tcMar>
               <w:right w:w="0" w:type="dxa"/>
             </w:tcMar>
@@ -6207,7 +5985,6 @@
               <w:bottom w:val="single" w:sz="12" w:space="0" w:color="000001"/>
               <w:right w:val="single" w:sz="12" w:space="0" w:color="000001"/>
             </w:tcBorders>
-            <w:shd w:val="clear" w:color="auto" w:fill="auto"/>
             <w:tcMar>
               <w:right w:w="0" w:type="dxa"/>
             </w:tcMar>
@@ -6233,7 +6010,6 @@
               <w:bottom w:val="single" w:sz="12" w:space="0" w:color="000001"/>
               <w:right w:val="single" w:sz="12" w:space="0" w:color="000001"/>
             </w:tcBorders>
-            <w:shd w:val="clear" w:color="auto" w:fill="auto"/>
             <w:tcMar>
               <w:right w:w="0" w:type="dxa"/>
             </w:tcMar>
@@ -6259,7 +6035,6 @@
               <w:bottom w:val="single" w:sz="12" w:space="0" w:color="000001"/>
               <w:right w:val="single" w:sz="12" w:space="0" w:color="000001"/>
             </w:tcBorders>
-            <w:shd w:val="clear" w:color="auto" w:fill="auto"/>
             <w:tcMar>
               <w:right w:w="0" w:type="dxa"/>
             </w:tcMar>
@@ -6285,7 +6060,6 @@
               <w:bottom w:val="single" w:sz="12" w:space="0" w:color="000001"/>
               <w:right w:val="single" w:sz="12" w:space="0" w:color="000001"/>
             </w:tcBorders>
-            <w:shd w:val="clear" w:color="auto" w:fill="auto"/>
             <w:tcMar>
               <w:right w:w="0" w:type="dxa"/>
             </w:tcMar>
@@ -6311,7 +6085,6 @@
               <w:bottom w:val="single" w:sz="12" w:space="0" w:color="000001"/>
               <w:right w:val="single" w:sz="12" w:space="0" w:color="000001"/>
             </w:tcBorders>
-            <w:shd w:val="clear" w:color="auto" w:fill="auto"/>
             <w:tcMar>
               <w:right w:w="0" w:type="dxa"/>
             </w:tcMar>
@@ -6337,7 +6110,6 @@
               <w:bottom w:val="single" w:sz="12" w:space="0" w:color="000001"/>
               <w:right w:val="single" w:sz="12" w:space="0" w:color="000001"/>
             </w:tcBorders>
-            <w:shd w:val="clear" w:color="auto" w:fill="auto"/>
             <w:tcMar>
               <w:right w:w="0" w:type="dxa"/>
             </w:tcMar>
@@ -6363,7 +6135,6 @@
               <w:bottom w:val="single" w:sz="12" w:space="0" w:color="000001"/>
               <w:right w:val="single" w:sz="12" w:space="0" w:color="000001"/>
             </w:tcBorders>
-            <w:shd w:val="clear" w:color="auto" w:fill="auto"/>
             <w:tcMar>
               <w:right w:w="0" w:type="dxa"/>
             </w:tcMar>
@@ -6389,7 +6160,6 @@
               <w:bottom w:val="single" w:sz="12" w:space="0" w:color="000001"/>
               <w:right w:val="single" w:sz="12" w:space="0" w:color="000001"/>
             </w:tcBorders>
-            <w:shd w:val="clear" w:color="auto" w:fill="auto"/>
             <w:tcMar>
               <w:right w:w="0" w:type="dxa"/>
             </w:tcMar>
@@ -6421,7 +6191,6 @@
               <w:bottom w:val="single" w:sz="12" w:space="0" w:color="000001"/>
               <w:right w:val="single" w:sz="12" w:space="0" w:color="000001"/>
             </w:tcBorders>
-            <w:shd w:val="clear" w:color="auto" w:fill="auto"/>
             <w:tcMar>
               <w:right w:w="0" w:type="dxa"/>
             </w:tcMar>
@@ -6453,7 +6222,6 @@
               <w:bottom w:val="single" w:sz="12" w:space="0" w:color="000001"/>
               <w:right w:val="single" w:sz="12" w:space="0" w:color="000001"/>
             </w:tcBorders>
-            <w:shd w:val="clear" w:color="auto" w:fill="auto"/>
             <w:tcMar>
               <w:right w:w="0" w:type="dxa"/>
             </w:tcMar>
@@ -6485,7 +6253,6 @@
               <w:bottom w:val="single" w:sz="12" w:space="0" w:color="000001"/>
               <w:right w:val="single" w:sz="12" w:space="0" w:color="000001"/>
             </w:tcBorders>
-            <w:shd w:val="clear" w:color="auto" w:fill="auto"/>
             <w:tcMar>
               <w:right w:w="0" w:type="dxa"/>
             </w:tcMar>
@@ -6517,7 +6284,6 @@
               <w:bottom w:val="single" w:sz="12" w:space="0" w:color="000001"/>
               <w:right w:val="single" w:sz="12" w:space="0" w:color="000001"/>
             </w:tcBorders>
-            <w:shd w:val="clear" w:color="auto" w:fill="auto"/>
             <w:vAlign w:val="center"/>
           </w:tcPr>
           <w:p>
@@ -6546,7 +6312,6 @@
               <w:bottom w:val="single" w:sz="12" w:space="0" w:color="000001"/>
               <w:right w:val="single" w:sz="12" w:space="0" w:color="000001"/>
             </w:tcBorders>
-            <w:shd w:val="clear" w:color="auto" w:fill="auto"/>
             <w:tcMar>
               <w:right w:w="0" w:type="dxa"/>
             </w:tcMar>
@@ -6572,7 +6337,6 @@
               <w:bottom w:val="single" w:sz="12" w:space="0" w:color="000001"/>
               <w:right w:val="single" w:sz="12" w:space="0" w:color="000001"/>
             </w:tcBorders>
-            <w:shd w:val="clear" w:color="auto" w:fill="auto"/>
             <w:tcMar>
               <w:right w:w="0" w:type="dxa"/>
             </w:tcMar>
@@ -6598,7 +6362,6 @@
               <w:bottom w:val="single" w:sz="12" w:space="0" w:color="000001"/>
               <w:right w:val="single" w:sz="12" w:space="0" w:color="000001"/>
             </w:tcBorders>
-            <w:shd w:val="clear" w:color="auto" w:fill="auto"/>
             <w:tcMar>
               <w:right w:w="0" w:type="dxa"/>
             </w:tcMar>
@@ -6624,7 +6387,6 @@
               <w:bottom w:val="single" w:sz="12" w:space="0" w:color="000001"/>
               <w:right w:val="single" w:sz="12" w:space="0" w:color="000001"/>
             </w:tcBorders>
-            <w:shd w:val="clear" w:color="auto" w:fill="auto"/>
             <w:tcMar>
               <w:right w:w="0" w:type="dxa"/>
             </w:tcMar>
@@ -6650,7 +6412,6 @@
               <w:bottom w:val="single" w:sz="12" w:space="0" w:color="000001"/>
               <w:right w:val="single" w:sz="12" w:space="0" w:color="000001"/>
             </w:tcBorders>
-            <w:shd w:val="clear" w:color="auto" w:fill="auto"/>
             <w:tcMar>
               <w:right w:w="0" w:type="dxa"/>
             </w:tcMar>
@@ -6676,7 +6437,6 @@
               <w:bottom w:val="single" w:sz="12" w:space="0" w:color="000001"/>
               <w:right w:val="single" w:sz="12" w:space="0" w:color="000001"/>
             </w:tcBorders>
-            <w:shd w:val="clear" w:color="auto" w:fill="auto"/>
             <w:tcMar>
               <w:right w:w="0" w:type="dxa"/>
             </w:tcMar>
@@ -6702,7 +6462,6 @@
               <w:bottom w:val="single" w:sz="12" w:space="0" w:color="000001"/>
               <w:right w:val="single" w:sz="12" w:space="0" w:color="000001"/>
             </w:tcBorders>
-            <w:shd w:val="clear" w:color="auto" w:fill="auto"/>
             <w:tcMar>
               <w:right w:w="0" w:type="dxa"/>
             </w:tcMar>
@@ -6728,7 +6487,6 @@
               <w:bottom w:val="single" w:sz="12" w:space="0" w:color="000001"/>
               <w:right w:val="single" w:sz="12" w:space="0" w:color="000001"/>
             </w:tcBorders>
-            <w:shd w:val="clear" w:color="auto" w:fill="auto"/>
             <w:tcMar>
               <w:right w:w="0" w:type="dxa"/>
             </w:tcMar>
@@ -6754,7 +6512,6 @@
               <w:bottom w:val="single" w:sz="12" w:space="0" w:color="000001"/>
               <w:right w:val="single" w:sz="12" w:space="0" w:color="000001"/>
             </w:tcBorders>
-            <w:shd w:val="clear" w:color="auto" w:fill="auto"/>
             <w:tcMar>
               <w:right w:w="0" w:type="dxa"/>
             </w:tcMar>
@@ -6780,7 +6537,6 @@
               <w:bottom w:val="single" w:sz="12" w:space="0" w:color="000001"/>
               <w:right w:val="single" w:sz="12" w:space="0" w:color="000001"/>
             </w:tcBorders>
-            <w:shd w:val="clear" w:color="auto" w:fill="auto"/>
             <w:tcMar>
               <w:right w:w="0" w:type="dxa"/>
             </w:tcMar>
@@ -6812,7 +6568,6 @@
               <w:bottom w:val="single" w:sz="12" w:space="0" w:color="000001"/>
               <w:right w:val="single" w:sz="12" w:space="0" w:color="000001"/>
             </w:tcBorders>
-            <w:shd w:val="clear" w:color="auto" w:fill="auto"/>
             <w:tcMar>
               <w:right w:w="0" w:type="dxa"/>
             </w:tcMar>
@@ -6844,7 +6599,6 @@
               <w:bottom w:val="single" w:sz="12" w:space="0" w:color="000001"/>
               <w:right w:val="single" w:sz="12" w:space="0" w:color="000001"/>
             </w:tcBorders>
-            <w:shd w:val="clear" w:color="auto" w:fill="auto"/>
             <w:tcMar>
               <w:right w:w="0" w:type="dxa"/>
             </w:tcMar>
@@ -6875,7 +6629,6 @@
               <w:bottom w:val="single" w:sz="12" w:space="0" w:color="000001"/>
               <w:right w:val="single" w:sz="12" w:space="0" w:color="000001"/>
             </w:tcBorders>
-            <w:shd w:val="clear" w:color="auto" w:fill="auto"/>
             <w:vAlign w:val="center"/>
           </w:tcPr>
           <w:p>
@@ -6903,7 +6656,6 @@
               <w:bottom w:val="single" w:sz="12" w:space="0" w:color="000001"/>
               <w:right w:val="single" w:sz="12" w:space="0" w:color="000001"/>
             </w:tcBorders>
-            <w:shd w:val="clear" w:color="auto" w:fill="auto"/>
             <w:tcMar>
               <w:right w:w="0" w:type="dxa"/>
             </w:tcMar>
@@ -6928,7 +6680,6 @@
               <w:bottom w:val="single" w:sz="12" w:space="0" w:color="000001"/>
               <w:right w:val="single" w:sz="12" w:space="0" w:color="000001"/>
             </w:tcBorders>
-            <w:shd w:val="clear" w:color="auto" w:fill="auto"/>
             <w:tcMar>
               <w:right w:w="0" w:type="dxa"/>
             </w:tcMar>
@@ -6953,7 +6704,6 @@
               <w:bottom w:val="single" w:sz="12" w:space="0" w:color="000001"/>
               <w:right w:val="single" w:sz="12" w:space="0" w:color="000001"/>
             </w:tcBorders>
-            <w:shd w:val="clear" w:color="auto" w:fill="auto"/>
             <w:tcMar>
               <w:right w:w="0" w:type="dxa"/>
             </w:tcMar>
@@ -6978,7 +6728,6 @@
               <w:bottom w:val="single" w:sz="12" w:space="0" w:color="000001"/>
               <w:right w:val="single" w:sz="12" w:space="0" w:color="000001"/>
             </w:tcBorders>
-            <w:shd w:val="clear" w:color="auto" w:fill="auto"/>
             <w:tcMar>
               <w:right w:w="0" w:type="dxa"/>
             </w:tcMar>
@@ -7003,7 +6752,6 @@
               <w:bottom w:val="single" w:sz="12" w:space="0" w:color="000001"/>
               <w:right w:val="single" w:sz="12" w:space="0" w:color="000001"/>
             </w:tcBorders>
-            <w:shd w:val="clear" w:color="auto" w:fill="auto"/>
             <w:tcMar>
               <w:right w:w="0" w:type="dxa"/>
             </w:tcMar>
@@ -7034,7 +6782,6 @@
               <w:bottom w:val="single" w:sz="12" w:space="0" w:color="000001"/>
               <w:right w:val="single" w:sz="12" w:space="0" w:color="000001"/>
             </w:tcBorders>
-            <w:shd w:val="clear" w:color="auto" w:fill="auto"/>
             <w:tcMar>
               <w:right w:w="0" w:type="dxa"/>
             </w:tcMar>
@@ -7059,7 +6806,6 @@
               <w:bottom w:val="single" w:sz="12" w:space="0" w:color="000001"/>
               <w:right w:val="single" w:sz="12" w:space="0" w:color="000001"/>
             </w:tcBorders>
-            <w:shd w:val="clear" w:color="auto" w:fill="auto"/>
             <w:tcMar>
               <w:right w:w="0" w:type="dxa"/>
             </w:tcMar>
@@ -7090,7 +6836,6 @@
               <w:bottom w:val="single" w:sz="12" w:space="0" w:color="000001"/>
               <w:right w:val="single" w:sz="12" w:space="0" w:color="000001"/>
             </w:tcBorders>
-            <w:shd w:val="clear" w:color="auto" w:fill="auto"/>
             <w:tcMar>
               <w:right w:w="0" w:type="dxa"/>
             </w:tcMar>
@@ -7115,7 +6860,6 @@
               <w:bottom w:val="single" w:sz="12" w:space="0" w:color="000001"/>
               <w:right w:val="single" w:sz="12" w:space="0" w:color="000001"/>
             </w:tcBorders>
-            <w:shd w:val="clear" w:color="auto" w:fill="auto"/>
             <w:tcMar>
               <w:right w:w="0" w:type="dxa"/>
             </w:tcMar>
@@ -7146,7 +6890,6 @@
               <w:bottom w:val="single" w:sz="12" w:space="0" w:color="000001"/>
               <w:right w:val="single" w:sz="12" w:space="0" w:color="000001"/>
             </w:tcBorders>
-            <w:shd w:val="clear" w:color="auto" w:fill="auto"/>
             <w:tcMar>
               <w:right w:w="0" w:type="dxa"/>
             </w:tcMar>
@@ -7171,7 +6914,6 @@
               <w:bottom w:val="single" w:sz="12" w:space="0" w:color="000001"/>
               <w:right w:val="single" w:sz="12" w:space="0" w:color="000001"/>
             </w:tcBorders>
-            <w:shd w:val="clear" w:color="auto" w:fill="auto"/>
             <w:tcMar>
               <w:right w:w="0" w:type="dxa"/>
             </w:tcMar>
@@ -7202,7 +6944,6 @@
               <w:bottom w:val="single" w:sz="12" w:space="0" w:color="000001"/>
               <w:right w:val="single" w:sz="12" w:space="0" w:color="000001"/>
             </w:tcBorders>
-            <w:shd w:val="clear" w:color="auto" w:fill="auto"/>
             <w:tcMar>
               <w:right w:w="0" w:type="dxa"/>
             </w:tcMar>
@@ -7240,7 +6981,6 @@
               <w:bottom w:val="single" w:sz="12" w:space="0" w:color="000001"/>
               <w:right w:val="single" w:sz="12" w:space="0" w:color="000001"/>
             </w:tcBorders>
-            <w:shd w:val="clear" w:color="auto" w:fill="auto"/>
             <w:vAlign w:val="center"/>
           </w:tcPr>
           <w:p>
@@ -7268,7 +7008,6 @@
               <w:bottom w:val="single" w:sz="12" w:space="0" w:color="000001"/>
               <w:right w:val="single" w:sz="4" w:space="0" w:color="000001"/>
             </w:tcBorders>
-            <w:shd w:val="clear" w:color="auto" w:fill="auto"/>
             <w:vAlign w:val="center"/>
           </w:tcPr>
           <w:p>
@@ -7291,7 +7030,6 @@
               <w:bottom w:val="single" w:sz="12" w:space="0" w:color="000001"/>
               <w:right w:val="single" w:sz="4" w:space="0" w:color="000001"/>
             </w:tcBorders>
-            <w:shd w:val="clear" w:color="auto" w:fill="auto"/>
             <w:tcMar>
               <w:left w:w="40" w:type="dxa"/>
             </w:tcMar>
@@ -7317,7 +7055,6 @@
               <w:bottom w:val="single" w:sz="12" w:space="0" w:color="000001"/>
               <w:right w:val="single" w:sz="4" w:space="0" w:color="000001"/>
             </w:tcBorders>
-            <w:shd w:val="clear" w:color="auto" w:fill="auto"/>
             <w:tcMar>
               <w:left w:w="40" w:type="dxa"/>
             </w:tcMar>
@@ -7343,7 +7080,6 @@
               <w:bottom w:val="single" w:sz="12" w:space="0" w:color="000001"/>
               <w:right w:val="single" w:sz="4" w:space="0" w:color="000001"/>
             </w:tcBorders>
-            <w:shd w:val="clear" w:color="auto" w:fill="auto"/>
             <w:tcMar>
               <w:left w:w="40" w:type="dxa"/>
             </w:tcMar>
@@ -7369,7 +7105,6 @@
               <w:bottom w:val="single" w:sz="12" w:space="0" w:color="000001"/>
               <w:right w:val="single" w:sz="4" w:space="0" w:color="000001"/>
             </w:tcBorders>
-            <w:shd w:val="clear" w:color="auto" w:fill="auto"/>
             <w:tcMar>
               <w:left w:w="40" w:type="dxa"/>
             </w:tcMar>
@@ -7395,7 +7130,6 @@
               <w:bottom w:val="single" w:sz="12" w:space="0" w:color="000001"/>
               <w:right w:val="single" w:sz="4" w:space="0" w:color="000001"/>
             </w:tcBorders>
-            <w:shd w:val="clear" w:color="auto" w:fill="auto"/>
             <w:tcMar>
               <w:left w:w="40" w:type="dxa"/>
             </w:tcMar>
@@ -7421,7 +7155,6 @@
               <w:bottom w:val="single" w:sz="12" w:space="0" w:color="000001"/>
               <w:right w:val="single" w:sz="4" w:space="0" w:color="000001"/>
             </w:tcBorders>
-            <w:shd w:val="clear" w:color="auto" w:fill="auto"/>
             <w:tcMar>
               <w:left w:w="40" w:type="dxa"/>
             </w:tcMar>
@@ -7447,7 +7180,6 @@
               <w:bottom w:val="single" w:sz="12" w:space="0" w:color="000001"/>
               <w:right w:val="single" w:sz="4" w:space="0" w:color="000001"/>
             </w:tcBorders>
-            <w:shd w:val="clear" w:color="auto" w:fill="auto"/>
             <w:tcMar>
               <w:left w:w="40" w:type="dxa"/>
             </w:tcMar>
@@ -7473,7 +7205,6 @@
               <w:bottom w:val="single" w:sz="12" w:space="0" w:color="000001"/>
               <w:right w:val="single" w:sz="4" w:space="0" w:color="000001"/>
             </w:tcBorders>
-            <w:shd w:val="clear" w:color="auto" w:fill="auto"/>
             <w:tcMar>
               <w:left w:w="40" w:type="dxa"/>
             </w:tcMar>
@@ -7499,7 +7230,6 @@
               <w:bottom w:val="single" w:sz="12" w:space="0" w:color="000001"/>
               <w:right w:val="single" w:sz="4" w:space="0" w:color="000001"/>
             </w:tcBorders>
-            <w:shd w:val="clear" w:color="auto" w:fill="auto"/>
             <w:tcMar>
               <w:left w:w="40" w:type="dxa"/>
             </w:tcMar>
@@ -7525,7 +7255,6 @@
               <w:bottom w:val="single" w:sz="12" w:space="0" w:color="000001"/>
               <w:right w:val="single" w:sz="4" w:space="0" w:color="000001"/>
             </w:tcBorders>
-            <w:shd w:val="clear" w:color="auto" w:fill="auto"/>
             <w:tcMar>
               <w:left w:w="40" w:type="dxa"/>
             </w:tcMar>
@@ -7551,7 +7280,6 @@
               <w:bottom w:val="single" w:sz="12" w:space="0" w:color="000001"/>
               <w:right w:val="single" w:sz="12" w:space="0" w:color="000001"/>
             </w:tcBorders>
-            <w:shd w:val="clear" w:color="auto" w:fill="auto"/>
             <w:tcMar>
               <w:left w:w="40" w:type="dxa"/>
             </w:tcMar>
@@ -7645,39 +7373,7 @@
           <w:rFonts w:ascii="Times New Roman" w:hAnsi="Times New Roman" w:cs="Times New Roman"/>
           <w:lang w:val="en-US"/>
         </w:rPr>
-        <w:t xml:space="preserve">[Carbonetto2014] </w:t>
-      </w:r>
-      <w:proofErr w:type="spellStart"/>
-      <w:r>
-        <w:rPr>
-          <w:rFonts w:ascii="Times New Roman" w:hAnsi="Times New Roman" w:cs="Times New Roman"/>
-          <w:lang w:val="en-US"/>
-        </w:rPr>
-        <w:t>Carbonetto</w:t>
-      </w:r>
-      <w:proofErr w:type="spellEnd"/>
-      <w:r>
-        <w:rPr>
-          <w:rFonts w:ascii="Times New Roman" w:hAnsi="Times New Roman" w:cs="Times New Roman"/>
-          <w:lang w:val="en-US"/>
-        </w:rPr>
-        <w:t xml:space="preserve">, S., M. Garcia-Inza, José </w:t>
-      </w:r>
-      <w:proofErr w:type="spellStart"/>
-      <w:r>
-        <w:rPr>
-          <w:rFonts w:ascii="Times New Roman" w:hAnsi="Times New Roman" w:cs="Times New Roman"/>
-          <w:lang w:val="en-US"/>
-        </w:rPr>
-        <w:t>Lipovetzky</w:t>
-      </w:r>
-      <w:proofErr w:type="spellEnd"/>
-      <w:r>
-        <w:rPr>
-          <w:rFonts w:ascii="Times New Roman" w:hAnsi="Times New Roman" w:cs="Times New Roman"/>
-          <w:lang w:val="en-US"/>
-        </w:rPr>
-        <w:t>, Martin Javier Carra, E. Redin, L. Sambuco Salomone, and A. Faigon. "CMOS differential and amplified dosimeter with field oxide n-channel MOSFETs." IEEE TNS 61, no. 6 (2014): 3466-3471.</w:t>
+        <w:t>[Carbonetto2014] Carbonetto, S., M. Garcia-Inza, José Lipovetzky, Martin Javier Carra, E. Redin, L. Sambuco Salomone, and A. Faigon. "CMOS differential and amplified dosimeter with field oxide n-channel MOSFETs." IEEE TNS 61, no. 6 (2014): 3466-3471.</w:t>
       </w:r>
     </w:p>
     <w:p>
@@ -7694,55 +7390,7 @@
           <w:rFonts w:ascii="Times New Roman" w:hAnsi="Times New Roman" w:cs="Times New Roman"/>
           <w:lang w:val="en-US"/>
         </w:rPr>
-        <w:t xml:space="preserve">[Carbonetto2020] </w:t>
-      </w:r>
-      <w:proofErr w:type="spellStart"/>
-      <w:r>
-        <w:rPr>
-          <w:rFonts w:ascii="Times New Roman" w:hAnsi="Times New Roman" w:cs="Times New Roman"/>
-          <w:lang w:val="en-US"/>
-        </w:rPr>
-        <w:t>Carbonetto</w:t>
-      </w:r>
-      <w:proofErr w:type="spellEnd"/>
-      <w:r>
-        <w:rPr>
-          <w:rFonts w:ascii="Times New Roman" w:hAnsi="Times New Roman" w:cs="Times New Roman"/>
-          <w:lang w:val="en-US"/>
-        </w:rPr>
-        <w:t xml:space="preserve">, S., M. </w:t>
-      </w:r>
-      <w:proofErr w:type="spellStart"/>
-      <w:r>
-        <w:rPr>
-          <w:rFonts w:ascii="Times New Roman" w:hAnsi="Times New Roman" w:cs="Times New Roman"/>
-          <w:lang w:val="en-US"/>
-        </w:rPr>
-        <w:t>Echarri</w:t>
-      </w:r>
-      <w:proofErr w:type="spellEnd"/>
-      <w:r>
-        <w:rPr>
-          <w:rFonts w:ascii="Times New Roman" w:hAnsi="Times New Roman" w:cs="Times New Roman"/>
-          <w:lang w:val="en-US"/>
-        </w:rPr>
-        <w:t xml:space="preserve">, J. </w:t>
-      </w:r>
-      <w:proofErr w:type="spellStart"/>
-      <w:r>
-        <w:rPr>
-          <w:rFonts w:ascii="Times New Roman" w:hAnsi="Times New Roman" w:cs="Times New Roman"/>
-          <w:lang w:val="en-US"/>
-        </w:rPr>
-        <w:t>Lipovetzky</w:t>
-      </w:r>
-      <w:proofErr w:type="spellEnd"/>
-      <w:r>
-        <w:rPr>
-          <w:rFonts w:ascii="Times New Roman" w:hAnsi="Times New Roman" w:cs="Times New Roman"/>
-          <w:lang w:val="en-US"/>
-        </w:rPr>
-        <w:t>, M. Garcia–Inza, and A. Faigon. "Temperature-compensated MOS dosimeter fully integrated in a high-voltage 0.35 µm CMOS process." IEEE TNS (2020).</w:t>
+        <w:t>[Carbonetto2020] Carbonetto, S., M. Echarri, J. Lipovetzky, M. Garcia–Inza, and A. Faigon. "Temperature-compensated MOS dosimeter fully integrated in a high-voltage 0.35 µm CMOS process." IEEE TNS (2020).</w:t>
       </w:r>
     </w:p>
     <w:p>
@@ -7759,23 +7407,7 @@
           <w:rFonts w:ascii="Times New Roman" w:hAnsi="Times New Roman" w:cs="Times New Roman"/>
           <w:lang w:val="en-US"/>
         </w:rPr>
-        <w:t xml:space="preserve">[Carbonetto2021] S. </w:t>
-      </w:r>
-      <w:proofErr w:type="spellStart"/>
-      <w:r>
-        <w:rPr>
-          <w:rFonts w:ascii="Times New Roman" w:hAnsi="Times New Roman" w:cs="Times New Roman"/>
-          <w:lang w:val="en-US"/>
-        </w:rPr>
-        <w:t>Carbonetto</w:t>
-      </w:r>
-      <w:proofErr w:type="spellEnd"/>
-      <w:r>
-        <w:rPr>
-          <w:rFonts w:ascii="Times New Roman" w:hAnsi="Times New Roman" w:cs="Times New Roman"/>
-          <w:lang w:val="en-US"/>
-        </w:rPr>
-        <w:t>, L. Genovese, L. Sambuco Salomone, M. Garcia-Inza, E. G. Redin, A. Faigon, “Total Ionizing Dose Effects on Floating Gate Structures. Preliminary Results”, 22nd Latin-American Test Symposium 2021 (LATS).</w:t>
+        <w:t>[Carbonetto2021] S. Carbonetto, L. Genovese, L. Sambuco Salomone, M. Garcia-Inza, E. G. Redin, A. Faigon, “Total Ionizing Dose Effects on Floating Gate Structures. Preliminary Results”, 22nd Latin-American Test Symposium 2021 (LATS).</w:t>
       </w:r>
     </w:p>
     <w:p>
@@ -7792,39 +7424,7 @@
           <w:rFonts w:ascii="Times New Roman" w:hAnsi="Times New Roman" w:cs="Times New Roman"/>
           <w:lang w:val="en-US"/>
         </w:rPr>
-        <w:t xml:space="preserve">[GarciaInza2014] Garcia-Inza, M., S. </w:t>
-      </w:r>
-      <w:proofErr w:type="spellStart"/>
-      <w:r>
-        <w:rPr>
-          <w:rFonts w:ascii="Times New Roman" w:hAnsi="Times New Roman" w:cs="Times New Roman"/>
-          <w:lang w:val="en-US"/>
-        </w:rPr>
-        <w:t>Carbonetto</w:t>
-      </w:r>
-      <w:proofErr w:type="spellEnd"/>
-      <w:r>
-        <w:rPr>
-          <w:rFonts w:ascii="Times New Roman" w:hAnsi="Times New Roman" w:cs="Times New Roman"/>
-          <w:lang w:val="en-US"/>
-        </w:rPr>
-        <w:t xml:space="preserve">, José </w:t>
-      </w:r>
-      <w:proofErr w:type="spellStart"/>
-      <w:r>
-        <w:rPr>
-          <w:rFonts w:ascii="Times New Roman" w:hAnsi="Times New Roman" w:cs="Times New Roman"/>
-          <w:lang w:val="en-US"/>
-        </w:rPr>
-        <w:t>Lipovetzky</w:t>
-      </w:r>
-      <w:proofErr w:type="spellEnd"/>
-      <w:r>
-        <w:rPr>
-          <w:rFonts w:ascii="Times New Roman" w:hAnsi="Times New Roman" w:cs="Times New Roman"/>
-          <w:lang w:val="en-US"/>
-        </w:rPr>
-        <w:t>, Martin Javier Carra, L. Sambuco Salomone, E. G. Redin, and A. Faigon. "Switched bias differential MOSFET dosimeter." IEEE TNS 61, no. 3 (2014).</w:t>
+        <w:t>[GarciaInza2014] Garcia-Inza, M., S. Carbonetto, José Lipovetzky, Martin Javier Carra, L. Sambuco Salomone, E. G. Redin, and A. Faigon. "Switched bias differential MOSFET dosimeter." IEEE TNS 61, no. 3 (2014).</w:t>
       </w:r>
     </w:p>
     <w:p>
@@ -7841,39 +7441,7 @@
           <w:lang w:val="en-US"/>
         </w:rPr>
         <w:lastRenderedPageBreak/>
-        <w:t xml:space="preserve">[GarciaInza2016] Garcia-Inza, Mariano, Sebastián H. </w:t>
-      </w:r>
-      <w:proofErr w:type="spellStart"/>
-      <w:r>
-        <w:rPr>
-          <w:rFonts w:ascii="Times New Roman" w:hAnsi="Times New Roman" w:cs="Times New Roman"/>
-          <w:lang w:val="en-US"/>
-        </w:rPr>
-        <w:t>Carbonetto</w:t>
-      </w:r>
-      <w:proofErr w:type="spellEnd"/>
-      <w:r>
-        <w:rPr>
-          <w:rFonts w:ascii="Times New Roman" w:hAnsi="Times New Roman" w:cs="Times New Roman"/>
-          <w:lang w:val="en-US"/>
-        </w:rPr>
-        <w:t xml:space="preserve">, José </w:t>
-      </w:r>
-      <w:proofErr w:type="spellStart"/>
-      <w:r>
-        <w:rPr>
-          <w:rFonts w:ascii="Times New Roman" w:hAnsi="Times New Roman" w:cs="Times New Roman"/>
-          <w:lang w:val="en-US"/>
-        </w:rPr>
-        <w:t>Lipovetzky</w:t>
-      </w:r>
-      <w:proofErr w:type="spellEnd"/>
-      <w:r>
-        <w:rPr>
-          <w:rFonts w:ascii="Times New Roman" w:hAnsi="Times New Roman" w:cs="Times New Roman"/>
-          <w:lang w:val="en-US"/>
-        </w:rPr>
-        <w:t xml:space="preserve">, and Adrian Faigon. "Radiation sensor based on MOSFETs mismatch amplification for radiotherapy applications." </w:t>
+        <w:t xml:space="preserve">[GarciaInza2016] Garcia-Inza, Mariano, Sebastián H. Carbonetto, José Lipovetzky, and Adrian Faigon. "Radiation sensor based on MOSFETs mismatch amplification for radiotherapy applications." </w:t>
       </w:r>
       <w:r>
         <w:rPr>
@@ -7895,63 +7463,7 @@
         <w:rPr>
           <w:rFonts w:ascii="Times New Roman" w:hAnsi="Times New Roman" w:cs="Times New Roman"/>
         </w:rPr>
-        <w:t xml:space="preserve">[GarciaInza2018] </w:t>
-      </w:r>
-      <w:proofErr w:type="spellStart"/>
-      <w:r>
-        <w:rPr>
-          <w:rFonts w:ascii="Times New Roman" w:hAnsi="Times New Roman" w:cs="Times New Roman"/>
-        </w:rPr>
-        <w:t>Garcia-Inza</w:t>
-      </w:r>
-      <w:proofErr w:type="spellEnd"/>
-      <w:r>
-        <w:rPr>
-          <w:rFonts w:ascii="Times New Roman" w:hAnsi="Times New Roman" w:cs="Times New Roman"/>
-        </w:rPr>
-        <w:t xml:space="preserve">, M., M. </w:t>
-      </w:r>
-      <w:proofErr w:type="spellStart"/>
-      <w:r>
-        <w:rPr>
-          <w:rFonts w:ascii="Times New Roman" w:hAnsi="Times New Roman" w:cs="Times New Roman"/>
-        </w:rPr>
-        <w:t>Cassani</w:t>
-      </w:r>
-      <w:proofErr w:type="spellEnd"/>
-      <w:r>
-        <w:rPr>
-          <w:rFonts w:ascii="Times New Roman" w:hAnsi="Times New Roman" w:cs="Times New Roman"/>
-        </w:rPr>
-        <w:t xml:space="preserve">, S. </w:t>
-      </w:r>
-      <w:proofErr w:type="spellStart"/>
-      <w:r>
-        <w:rPr>
-          <w:rFonts w:ascii="Times New Roman" w:hAnsi="Times New Roman" w:cs="Times New Roman"/>
-        </w:rPr>
-        <w:t>Carbonetto</w:t>
-      </w:r>
-      <w:proofErr w:type="spellEnd"/>
-      <w:r>
-        <w:rPr>
-          <w:rFonts w:ascii="Times New Roman" w:hAnsi="Times New Roman" w:cs="Times New Roman"/>
-        </w:rPr>
-        <w:t xml:space="preserve">, M. Casal, E. Redin, and A. </w:t>
-      </w:r>
-      <w:proofErr w:type="spellStart"/>
-      <w:r>
-        <w:rPr>
-          <w:rFonts w:ascii="Times New Roman" w:hAnsi="Times New Roman" w:cs="Times New Roman"/>
-        </w:rPr>
-        <w:t>Faigón</w:t>
-      </w:r>
-      <w:proofErr w:type="spellEnd"/>
-      <w:r>
-        <w:rPr>
-          <w:rFonts w:ascii="Times New Roman" w:hAnsi="Times New Roman" w:cs="Times New Roman"/>
-        </w:rPr>
-        <w:t xml:space="preserve">. </w:t>
+        <w:t xml:space="preserve">[GarciaInza2018] Garcia-Inza, M., M. Cassani, S. Carbonetto, M. Casal, E. Redin, and A. Faigón. </w:t>
       </w:r>
       <w:r>
         <w:rPr>
@@ -7975,55 +7487,7 @@
           <w:rFonts w:ascii="Times New Roman" w:hAnsi="Times New Roman" w:cs="Times New Roman"/>
           <w:lang w:val="en-US"/>
         </w:rPr>
-        <w:t xml:space="preserve">[Lipovetzky2013] </w:t>
-      </w:r>
-      <w:proofErr w:type="spellStart"/>
-      <w:r>
-        <w:rPr>
-          <w:rFonts w:ascii="Times New Roman" w:hAnsi="Times New Roman" w:cs="Times New Roman"/>
-          <w:lang w:val="en-US"/>
-        </w:rPr>
-        <w:t>Lipovetzky</w:t>
-      </w:r>
-      <w:proofErr w:type="spellEnd"/>
-      <w:r>
-        <w:rPr>
-          <w:rFonts w:ascii="Times New Roman" w:hAnsi="Times New Roman" w:cs="Times New Roman"/>
-          <w:lang w:val="en-US"/>
-        </w:rPr>
-        <w:t xml:space="preserve">, José, Mariano Andrés García-Inza, S. </w:t>
-      </w:r>
-      <w:proofErr w:type="spellStart"/>
-      <w:r>
-        <w:rPr>
-          <w:rFonts w:ascii="Times New Roman" w:hAnsi="Times New Roman" w:cs="Times New Roman"/>
-          <w:lang w:val="en-US"/>
-        </w:rPr>
-        <w:t>Carbonetto</w:t>
-      </w:r>
-      <w:proofErr w:type="spellEnd"/>
-      <w:r>
-        <w:rPr>
-          <w:rFonts w:ascii="Times New Roman" w:hAnsi="Times New Roman" w:cs="Times New Roman"/>
-          <w:lang w:val="en-US"/>
-        </w:rPr>
-        <w:t xml:space="preserve">, Martin Javier Carra, E. Redin, L. Sambuco Salomone, and A. Faigon. "Field oxide n-channel </w:t>
-      </w:r>
-      <w:proofErr w:type="spellStart"/>
-      <w:r>
-        <w:rPr>
-          <w:rFonts w:ascii="Times New Roman" w:hAnsi="Times New Roman" w:cs="Times New Roman"/>
-          <w:lang w:val="en-US"/>
-        </w:rPr>
-        <w:t>mos</w:t>
-      </w:r>
-      <w:proofErr w:type="spellEnd"/>
-      <w:r>
-        <w:rPr>
-          <w:rFonts w:ascii="Times New Roman" w:hAnsi="Times New Roman" w:cs="Times New Roman"/>
-          <w:lang w:val="en-US"/>
-        </w:rPr>
-        <w:t xml:space="preserve"> dosimeters fabricated in CMOS processes." IEEE TNS 60, no. 6 (2013): 4683-4691.</w:t>
+        <w:t>[Lipovetzky2013] Lipovetzky, José, Mariano Andrés García-Inza, S. Carbonetto, Martin Javier Carra, E. Redin, L. Sambuco Salomone, and A. Faigon. "Field oxide n-channel mos dosimeters fabricated in CMOS processes." IEEE TNS 60, no. 6 (2013): 4683-4691.</w:t>
       </w:r>
     </w:p>
     <w:p>
@@ -8040,39 +7504,7 @@
           <w:rFonts w:ascii="Times New Roman" w:hAnsi="Times New Roman" w:cs="Times New Roman"/>
           <w:lang w:val="en-US"/>
         </w:rPr>
-        <w:t xml:space="preserve">[Sambuco2022] L. Sambuco Salomone, M. Garcia-Inza, S. </w:t>
-      </w:r>
-      <w:proofErr w:type="spellStart"/>
-      <w:r>
-        <w:rPr>
-          <w:rFonts w:ascii="Times New Roman" w:hAnsi="Times New Roman" w:cs="Times New Roman"/>
-          <w:lang w:val="en-US"/>
-        </w:rPr>
-        <w:t>Carbonetto</w:t>
-      </w:r>
-      <w:proofErr w:type="spellEnd"/>
-      <w:r>
-        <w:rPr>
-          <w:rFonts w:ascii="Times New Roman" w:hAnsi="Times New Roman" w:cs="Times New Roman"/>
-          <w:lang w:val="en-US"/>
-        </w:rPr>
-        <w:t xml:space="preserve">, J. </w:t>
-      </w:r>
-      <w:proofErr w:type="spellStart"/>
-      <w:r>
-        <w:rPr>
-          <w:rFonts w:ascii="Times New Roman" w:hAnsi="Times New Roman" w:cs="Times New Roman"/>
-          <w:lang w:val="en-US"/>
-        </w:rPr>
-        <w:t>Lipovetzky</w:t>
-      </w:r>
-      <w:proofErr w:type="spellEnd"/>
-      <w:r>
-        <w:rPr>
-          <w:rFonts w:ascii="Times New Roman" w:hAnsi="Times New Roman" w:cs="Times New Roman"/>
-          <w:lang w:val="en-US"/>
-        </w:rPr>
-        <w:t>, E. Redin, A. Faigon, “Modeling switched bias irradiations on floating gate devices. Application to dosimetry”, IEEE TNS 69, no. 6 (2022): 1229-1235.</w:t>
+        <w:t>[Sambuco2022] L. Sambuco Salomone, M. Garcia-Inza, S. Carbonetto, J. Lipovetzky, E. Redin, A. Faigon, “Modeling switched bias irradiations on floating gate devices. Application to dosimetry”, IEEE TNS 69, no. 6 (2022): 1229-1235.</w:t>
       </w:r>
     </w:p>
     <w:p>
@@ -8095,7 +7527,6 @@
           <w:lang w:val="en-US"/>
         </w:rPr>
       </w:pPr>
-      <w:proofErr w:type="spellStart"/>
       <w:r>
         <w:rPr>
           <w:rFonts w:ascii="Times New Roman" w:hAnsi="Times New Roman" w:cs="Times New Roman"/>
@@ -8104,31 +7535,8 @@
           <w:color w:val="00000A"/>
           <w:lang w:val="en-US"/>
         </w:rPr>
-        <w:t>Bibliografía</w:t>
-      </w:r>
-      <w:proofErr w:type="spellEnd"/>
-      <w:r>
-        <w:rPr>
-          <w:rFonts w:ascii="Times New Roman" w:hAnsi="Times New Roman" w:cs="Times New Roman"/>
-          <w:b/>
-          <w:bCs/>
-          <w:color w:val="00000A"/>
-          <w:lang w:val="en-US"/>
-        </w:rPr>
-        <w:t xml:space="preserve"> </w:t>
-      </w:r>
-      <w:proofErr w:type="spellStart"/>
-      <w:r>
-        <w:rPr>
-          <w:rFonts w:ascii="Times New Roman" w:hAnsi="Times New Roman" w:cs="Times New Roman"/>
-          <w:b/>
-          <w:bCs/>
-          <w:color w:val="00000A"/>
-          <w:lang w:val="en-US"/>
-        </w:rPr>
-        <w:t>consultada</w:t>
-      </w:r>
-      <w:proofErr w:type="spellEnd"/>
+        <w:t>Bibliografía consultada</w:t>
+      </w:r>
     </w:p>
     <w:p>
       <w:pPr>
@@ -8178,39 +7586,7 @@
           <w:rFonts w:ascii="Times New Roman" w:hAnsi="Times New Roman" w:cs="Times New Roman"/>
           <w:lang w:val="en-US"/>
         </w:rPr>
-        <w:t xml:space="preserve">[Brucoli2017] </w:t>
-      </w:r>
-      <w:proofErr w:type="spellStart"/>
-      <w:r>
-        <w:rPr>
-          <w:rFonts w:ascii="Times New Roman" w:hAnsi="Times New Roman" w:cs="Times New Roman"/>
-          <w:lang w:val="en-US"/>
-        </w:rPr>
-        <w:t>Brucoli</w:t>
-      </w:r>
-      <w:proofErr w:type="spellEnd"/>
-      <w:r>
-        <w:rPr>
-          <w:rFonts w:ascii="Times New Roman" w:hAnsi="Times New Roman" w:cs="Times New Roman"/>
-          <w:lang w:val="en-US"/>
-        </w:rPr>
-        <w:t xml:space="preserve">, Matteo, Salvatore </w:t>
-      </w:r>
-      <w:proofErr w:type="spellStart"/>
-      <w:r>
-        <w:rPr>
-          <w:rFonts w:ascii="Times New Roman" w:hAnsi="Times New Roman" w:cs="Times New Roman"/>
-          <w:lang w:val="en-US"/>
-        </w:rPr>
-        <w:t>Danzeca</w:t>
-      </w:r>
-      <w:proofErr w:type="spellEnd"/>
-      <w:r>
-        <w:rPr>
-          <w:rFonts w:ascii="Times New Roman" w:hAnsi="Times New Roman" w:cs="Times New Roman"/>
-          <w:lang w:val="en-US"/>
-        </w:rPr>
-        <w:t>, Markus Brugger, Alessandro Masi, Alvaro Pineda, Joan Cesari, Laurent Dusseau, and Frédéric Wrobel. "Floating gate dosimeter suitability for accelerator-like environments." IEEE TNS 64, no. 8 (2017): 2054-2060.</w:t>
+        <w:t>[Brucoli2017] Brucoli, Matteo, Salvatore Danzeca, Markus Brugger, Alessandro Masi, Alvaro Pineda, Joan Cesari, Laurent Dusseau, and Frédéric Wrobel. "Floating gate dosimeter suitability for accelerator-like environments." IEEE TNS 64, no. 8 (2017): 2054-2060.</w:t>
       </w:r>
     </w:p>
     <w:p>
@@ -8227,87 +7603,7 @@
           <w:rFonts w:ascii="Times New Roman" w:hAnsi="Times New Roman" w:cs="Times New Roman"/>
           <w:lang w:val="en-US"/>
         </w:rPr>
-        <w:t xml:space="preserve">[Chatterjee2020] Chatterjee, Baibhab, </w:t>
-      </w:r>
-      <w:proofErr w:type="spellStart"/>
-      <w:r>
-        <w:rPr>
-          <w:rFonts w:ascii="Times New Roman" w:hAnsi="Times New Roman" w:cs="Times New Roman"/>
-          <w:lang w:val="en-US"/>
-        </w:rPr>
-        <w:t>Charilaos</w:t>
-      </w:r>
-      <w:proofErr w:type="spellEnd"/>
-      <w:r>
-        <w:rPr>
-          <w:rFonts w:ascii="Times New Roman" w:hAnsi="Times New Roman" w:cs="Times New Roman"/>
-          <w:lang w:val="en-US"/>
-        </w:rPr>
-        <w:t xml:space="preserve"> </w:t>
-      </w:r>
-      <w:proofErr w:type="spellStart"/>
-      <w:r>
-        <w:rPr>
-          <w:rFonts w:ascii="Times New Roman" w:hAnsi="Times New Roman" w:cs="Times New Roman"/>
-          <w:lang w:val="en-US"/>
-        </w:rPr>
-        <w:t>Mousoulis</w:t>
-      </w:r>
-      <w:proofErr w:type="spellEnd"/>
-      <w:r>
-        <w:rPr>
-          <w:rFonts w:ascii="Times New Roman" w:hAnsi="Times New Roman" w:cs="Times New Roman"/>
-          <w:lang w:val="en-US"/>
-        </w:rPr>
-        <w:t xml:space="preserve">, Dong-Hyun </w:t>
-      </w:r>
-      <w:proofErr w:type="spellStart"/>
-      <w:r>
-        <w:rPr>
-          <w:rFonts w:ascii="Times New Roman" w:hAnsi="Times New Roman" w:cs="Times New Roman"/>
-          <w:lang w:val="en-US"/>
-        </w:rPr>
-        <w:t>Seo</w:t>
-      </w:r>
-      <w:proofErr w:type="spellEnd"/>
-      <w:r>
-        <w:rPr>
-          <w:rFonts w:ascii="Times New Roman" w:hAnsi="Times New Roman" w:cs="Times New Roman"/>
-          <w:lang w:val="en-US"/>
-        </w:rPr>
-        <w:t xml:space="preserve">, Anurag Kumar, Shovan Maity, Sean M. Scott, Daniel J. Valentino, Dallas T. Morisette, Dimitrios </w:t>
-      </w:r>
-      <w:proofErr w:type="spellStart"/>
-      <w:r>
-        <w:rPr>
-          <w:rFonts w:ascii="Times New Roman" w:hAnsi="Times New Roman" w:cs="Times New Roman"/>
-          <w:lang w:val="en-US"/>
-        </w:rPr>
-        <w:t>Peroulis</w:t>
-      </w:r>
-      <w:proofErr w:type="spellEnd"/>
-      <w:r>
-        <w:rPr>
-          <w:rFonts w:ascii="Times New Roman" w:hAnsi="Times New Roman" w:cs="Times New Roman"/>
-          <w:lang w:val="en-US"/>
-        </w:rPr>
-        <w:t xml:space="preserve">, and Shreyas Sen. "A Wearable Real-Time CMOS Dosimeter </w:t>
-      </w:r>
-      <w:proofErr w:type="gramStart"/>
-      <w:r>
-        <w:rPr>
-          <w:rFonts w:ascii="Times New Roman" w:hAnsi="Times New Roman" w:cs="Times New Roman"/>
-          <w:lang w:val="en-US"/>
-        </w:rPr>
-        <w:t>With</w:t>
-      </w:r>
-      <w:proofErr w:type="gramEnd"/>
-      <w:r>
-        <w:rPr>
-          <w:rFonts w:ascii="Times New Roman" w:hAnsi="Times New Roman" w:cs="Times New Roman"/>
-          <w:lang w:val="en-US"/>
-        </w:rPr>
-        <w:t xml:space="preserve"> Integrated Zero-Bias Floating Gate Sensor and an 861-nW 18-Bit Energy-Resolution Scalable Time-Based Radiation to Digital Converter." IEEE Journal of Solid-State Circuits (2019).</w:t>
+        <w:t>[Chatterjee2020] Chatterjee, Baibhab, Charilaos Mousoulis, Dong-Hyun Seo, Anurag Kumar, Shovan Maity, Sean M. Scott, Daniel J. Valentino, Dallas T. Morisette, Dimitrios Peroulis, and Shreyas Sen. "A Wearable Real-Time CMOS Dosimeter With Integrated Zero-Bias Floating Gate Sensor and an 861-nW 18-Bit Energy-Resolution Scalable Time-Based Radiation to Digital Converter." IEEE Journal of Solid-State Circuits (2019).</w:t>
       </w:r>
     </w:p>
     <w:p>
@@ -8341,39 +7637,7 @@
           <w:rFonts w:ascii="Times New Roman" w:hAnsi="Times New Roman" w:cs="Times New Roman"/>
           <w:lang w:val="en-US"/>
         </w:rPr>
-        <w:t xml:space="preserve">[Kassabov1991] </w:t>
-      </w:r>
-      <w:proofErr w:type="spellStart"/>
-      <w:r>
-        <w:rPr>
-          <w:rFonts w:ascii="Times New Roman" w:hAnsi="Times New Roman" w:cs="Times New Roman"/>
-          <w:lang w:val="en-US"/>
-        </w:rPr>
-        <w:t>Kassabov</w:t>
-      </w:r>
-      <w:proofErr w:type="spellEnd"/>
-      <w:r>
-        <w:rPr>
-          <w:rFonts w:ascii="Times New Roman" w:hAnsi="Times New Roman" w:cs="Times New Roman"/>
-          <w:lang w:val="en-US"/>
-        </w:rPr>
-        <w:t xml:space="preserve">, J., N. </w:t>
-      </w:r>
-      <w:proofErr w:type="spellStart"/>
-      <w:r>
-        <w:rPr>
-          <w:rFonts w:ascii="Times New Roman" w:hAnsi="Times New Roman" w:cs="Times New Roman"/>
-          <w:lang w:val="en-US"/>
-        </w:rPr>
-        <w:t>Nedev</w:t>
-      </w:r>
-      <w:proofErr w:type="spellEnd"/>
-      <w:r>
-        <w:rPr>
-          <w:rFonts w:ascii="Times New Roman" w:hAnsi="Times New Roman" w:cs="Times New Roman"/>
-          <w:lang w:val="en-US"/>
-        </w:rPr>
-        <w:t>, and N. Smirnov. "Radiation dosimeter based on floating gate MOS transistor." Radiation Effects and Defects in Solids 116, no. 1-2 (1991): 155-158.</w:t>
+        <w:t>[Kassabov1991] Kassabov, J., N. Nedev, and N. Smirnov. "Radiation dosimeter based on floating gate MOS transistor." Radiation Effects and Defects in Solids 116, no. 1-2 (1991): 155-158.</w:t>
       </w:r>
     </w:p>
     <w:p>
@@ -8424,23 +7688,7 @@
           <w:rFonts w:ascii="Times New Roman" w:hAnsi="Times New Roman" w:cs="Times New Roman"/>
           <w:lang w:val="en-US"/>
         </w:rPr>
-        <w:t xml:space="preserve">[Poch1970] Poch, W. J., and A. G. Holmes-Siedle. "The </w:t>
-      </w:r>
-      <w:proofErr w:type="spellStart"/>
-      <w:r>
-        <w:rPr>
-          <w:rFonts w:ascii="Times New Roman" w:hAnsi="Times New Roman" w:cs="Times New Roman"/>
-          <w:lang w:val="en-US"/>
-        </w:rPr>
-        <w:t>mosimeter</w:t>
-      </w:r>
-      <w:proofErr w:type="spellEnd"/>
-      <w:r>
-        <w:rPr>
-          <w:rFonts w:ascii="Times New Roman" w:hAnsi="Times New Roman" w:cs="Times New Roman"/>
-          <w:lang w:val="en-US"/>
-        </w:rPr>
-        <w:t>—A new instrument for measuring radiation dose." RCA Engineer 16, no. 3 (1970): 56-59.</w:t>
+        <w:t>[Poch1970] Poch, W. J., and A. G. Holmes-Siedle. "The mosimeter—A new instrument for measuring radiation dose." RCA Engineer 16, no. 3 (1970): 56-59.</w:t>
       </w:r>
     </w:p>
     <w:p>
@@ -8474,23 +7722,7 @@
           <w:rFonts w:ascii="Times New Roman" w:hAnsi="Times New Roman" w:cs="Times New Roman"/>
           <w:lang w:val="en-US"/>
         </w:rPr>
-        <w:t xml:space="preserve">[Schwank2008] Schwank, James R., Marty R. Shaneyfelt, Daniel M. Fleetwood, James A. Felix, Paul E. Dodd, Philippe Paillet, and Véronique </w:t>
-      </w:r>
-      <w:proofErr w:type="spellStart"/>
-      <w:r>
-        <w:rPr>
-          <w:rFonts w:ascii="Times New Roman" w:hAnsi="Times New Roman" w:cs="Times New Roman"/>
-          <w:lang w:val="en-US"/>
-        </w:rPr>
-        <w:t>Ferlet-Cavrois</w:t>
-      </w:r>
-      <w:proofErr w:type="spellEnd"/>
-      <w:r>
-        <w:rPr>
-          <w:rFonts w:ascii="Times New Roman" w:hAnsi="Times New Roman" w:cs="Times New Roman"/>
-          <w:lang w:val="en-US"/>
-        </w:rPr>
-        <w:t>. "Radiation effects in MOS oxides." IEEE TNS 55, no. 4 (2008).</w:t>
+        <w:t>[Schwank2008] Schwank, James R., Marty R. Shaneyfelt, Daniel M. Fleetwood, James A. Felix, Paul E. Dodd, Philippe Paillet, and Véronique Ferlet-Cavrois. "Radiation effects in MOS oxides." IEEE TNS 55, no. 4 (2008).</w:t>
       </w:r>
     </w:p>
     <w:p>
@@ -8507,23 +7739,7 @@
           <w:rFonts w:ascii="Times New Roman" w:hAnsi="Times New Roman" w:cs="Times New Roman"/>
           <w:lang w:val="en-US"/>
         </w:rPr>
-        <w:t xml:space="preserve">[Tarr2004] Tarr, N. Garry, Ken Shortt, </w:t>
-      </w:r>
-      <w:proofErr w:type="spellStart"/>
-      <w:r>
-        <w:rPr>
-          <w:rFonts w:ascii="Times New Roman" w:hAnsi="Times New Roman" w:cs="Times New Roman"/>
-          <w:lang w:val="en-US"/>
-        </w:rPr>
-        <w:t>Yanbin</w:t>
-      </w:r>
-      <w:proofErr w:type="spellEnd"/>
-      <w:r>
-        <w:rPr>
-          <w:rFonts w:ascii="Times New Roman" w:hAnsi="Times New Roman" w:cs="Times New Roman"/>
-          <w:lang w:val="en-US"/>
-        </w:rPr>
-        <w:t xml:space="preserve"> Wang, and Ian Thomson. "A sensitive, temperature-compensated, zero-bias floating gate MOSFET dosimeter." IEEE TNS 51, no. 3 (2004).</w:t>
+        <w:t>[Tarr2004] Tarr, N. Garry, Ken Shortt, Yanbin Wang, and Ian Thomson. "A sensitive, temperature-compensated, zero-bias floating gate MOSFET dosimeter." IEEE TNS 51, no. 3 (2004).</w:t>
       </w:r>
     </w:p>
     <w:p>
@@ -8540,71 +7756,7 @@
           <w:rFonts w:ascii="Times New Roman" w:hAnsi="Times New Roman" w:cs="Times New Roman"/>
           <w:lang w:val="en-US"/>
         </w:rPr>
-        <w:t xml:space="preserve">[Villani2016] Villani, E. G., M. </w:t>
-      </w:r>
-      <w:proofErr w:type="spellStart"/>
-      <w:r>
-        <w:rPr>
-          <w:rFonts w:ascii="Times New Roman" w:hAnsi="Times New Roman" w:cs="Times New Roman"/>
-          <w:lang w:val="en-US"/>
-        </w:rPr>
-        <w:t>Crepaldi</w:t>
-      </w:r>
-      <w:proofErr w:type="spellEnd"/>
-      <w:r>
-        <w:rPr>
-          <w:rFonts w:ascii="Times New Roman" w:hAnsi="Times New Roman" w:cs="Times New Roman"/>
-          <w:lang w:val="en-US"/>
-        </w:rPr>
-        <w:t xml:space="preserve">, D. DeMarchi, A. Gabrielli, A. Khan, E. </w:t>
-      </w:r>
-      <w:proofErr w:type="spellStart"/>
-      <w:r>
-        <w:rPr>
-          <w:rFonts w:ascii="Times New Roman" w:hAnsi="Times New Roman" w:cs="Times New Roman"/>
-          <w:lang w:val="en-US"/>
-        </w:rPr>
-        <w:t>Pikhay</w:t>
-      </w:r>
-      <w:proofErr w:type="spellEnd"/>
-      <w:r>
-        <w:rPr>
-          <w:rFonts w:ascii="Times New Roman" w:hAnsi="Times New Roman" w:cs="Times New Roman"/>
-          <w:lang w:val="en-US"/>
-        </w:rPr>
-        <w:t xml:space="preserve">, Y. </w:t>
-      </w:r>
-      <w:proofErr w:type="spellStart"/>
-      <w:r>
-        <w:rPr>
-          <w:rFonts w:ascii="Times New Roman" w:hAnsi="Times New Roman" w:cs="Times New Roman"/>
-          <w:lang w:val="en-US"/>
-        </w:rPr>
-        <w:t>Roizin</w:t>
-      </w:r>
-      <w:proofErr w:type="spellEnd"/>
-      <w:r>
-        <w:rPr>
-          <w:rFonts w:ascii="Times New Roman" w:hAnsi="Times New Roman" w:cs="Times New Roman"/>
-          <w:lang w:val="en-US"/>
-        </w:rPr>
-        <w:t xml:space="preserve">, A. Rosenfeld, and </w:t>
-      </w:r>
-      <w:proofErr w:type="spellStart"/>
-      <w:r>
-        <w:rPr>
-          <w:rFonts w:ascii="Times New Roman" w:hAnsi="Times New Roman" w:cs="Times New Roman"/>
-          <w:lang w:val="en-US"/>
-        </w:rPr>
-        <w:t>Zhige</w:t>
-      </w:r>
-      <w:proofErr w:type="spellEnd"/>
-      <w:r>
-        <w:rPr>
-          <w:rFonts w:ascii="Times New Roman" w:hAnsi="Times New Roman" w:cs="Times New Roman"/>
-          <w:lang w:val="en-US"/>
-        </w:rPr>
-        <w:t xml:space="preserve"> Zhang. "A monolithic 180 nm CMOS dosimeter for wireless In Vivo Dosimetry." Radiation Measurements 84 (2016): 55-64.</w:t>
+        <w:t>[Villani2016] Villani, E. G., M. Crepaldi, D. DeMarchi, A. Gabrielli, A. Khan, E. Pikhay, Y. Roizin, A. Rosenfeld, and Zhige Zhang. "A monolithic 180 nm CMOS dosimeter for wireless In Vivo Dosimetry." Radiation Measurements 84 (2016): 55-64.</w:t>
       </w:r>
     </w:p>
     <w:p>
@@ -8621,23 +7773,7 @@
           <w:rFonts w:ascii="Times New Roman" w:hAnsi="Times New Roman" w:cs="Times New Roman"/>
           <w:lang w:val="en-US"/>
         </w:rPr>
-        <w:t xml:space="preserve">[Viswanathan1976] Viswanathan, C. R., and J. </w:t>
-      </w:r>
-      <w:proofErr w:type="spellStart"/>
-      <w:r>
-        <w:rPr>
-          <w:rFonts w:ascii="Times New Roman" w:hAnsi="Times New Roman" w:cs="Times New Roman"/>
-          <w:lang w:val="en-US"/>
-        </w:rPr>
-        <w:t>Maserjian</w:t>
-      </w:r>
-      <w:proofErr w:type="spellEnd"/>
-      <w:r>
-        <w:rPr>
-          <w:rFonts w:ascii="Times New Roman" w:hAnsi="Times New Roman" w:cs="Times New Roman"/>
-          <w:lang w:val="en-US"/>
-        </w:rPr>
-        <w:t>. "Model for thickness dependence of radiation charging in MOS structures." IEEE TNS 23, no. 6 (1976): 1540-1545.</w:t>
+        <w:t>[Viswanathan1976] Viswanathan, C. R., and J. Maserjian. "Model for thickness dependence of radiation charging in MOS structures." IEEE TNS 23, no. 6 (1976): 1540-1545.</w:t>
       </w:r>
     </w:p>
     <w:p>
@@ -8653,39 +7789,7 @@
           <w:rFonts w:ascii="Times New Roman" w:hAnsi="Times New Roman" w:cs="Times New Roman"/>
           <w:lang w:val="en-US"/>
         </w:rPr>
-        <w:t xml:space="preserve">[Zhang2019] Zhang, </w:t>
-      </w:r>
-      <w:proofErr w:type="spellStart"/>
-      <w:r>
-        <w:rPr>
-          <w:rFonts w:ascii="Times New Roman" w:hAnsi="Times New Roman" w:cs="Times New Roman"/>
-          <w:lang w:val="en-US"/>
-        </w:rPr>
-        <w:t>Chaoping</w:t>
-      </w:r>
-      <w:proofErr w:type="spellEnd"/>
-      <w:r>
-        <w:rPr>
-          <w:rFonts w:ascii="Times New Roman" w:hAnsi="Times New Roman" w:cs="Times New Roman"/>
-          <w:lang w:val="en-US"/>
-        </w:rPr>
-        <w:t xml:space="preserve">, and SM </w:t>
-      </w:r>
-      <w:proofErr w:type="spellStart"/>
-      <w:r>
-        <w:rPr>
-          <w:rFonts w:ascii="Times New Roman" w:hAnsi="Times New Roman" w:cs="Times New Roman"/>
-          <w:lang w:val="en-US"/>
-        </w:rPr>
-        <w:t>Rezaul</w:t>
-      </w:r>
-      <w:proofErr w:type="spellEnd"/>
-      <w:r>
-        <w:rPr>
-          <w:rFonts w:ascii="Times New Roman" w:hAnsi="Times New Roman" w:cs="Times New Roman"/>
-          <w:lang w:val="en-US"/>
-        </w:rPr>
-        <w:t xml:space="preserve"> Hasan. "A New Floating-gate Radiation Sensor and Readout Circuit in Standard Single-Poly 130-nm CMOS Technology." </w:t>
+        <w:t xml:space="preserve">[Zhang2019] Zhang, Chaoping, and SM Rezaul Hasan. "A New Floating-gate Radiation Sensor and Readout Circuit in Standard Single-Poly 130-nm CMOS Technology." </w:t>
       </w:r>
       <w:r>
         <w:rPr>
@@ -8712,7 +7816,7 @@
 </file>
 
 <file path=word/numbering.xml><?xml version="1.0" encoding="utf-8"?>
-<w:numbering xmlns:wpc="http://schemas.microsoft.com/office/word/2010/wordprocessingCanvas" xmlns:cx="http://schemas.microsoft.com/office/drawing/2014/chartex" xmlns:cx1="http://schemas.microsoft.com/office/drawing/2015/9/8/chartex" xmlns:cx2="http://schemas.microsoft.com/office/drawing/2015/10/21/chartex" xmlns:cx3="http://schemas.microsoft.com/office/drawing/2016/5/9/chartex" xmlns:cx4="http://schemas.microsoft.com/office/drawing/2016/5/10/chartex" xmlns:cx5="http://schemas.microsoft.com/office/drawing/2016/5/11/chartex" xmlns:cx6="http://schemas.microsoft.com/office/drawing/2016/5/12/chartex" xmlns:cx7="http://schemas.microsoft.com/office/drawing/2016/5/13/chartex" xmlns:cx8="http://schemas.microsoft.com/office/drawing/2016/5/14/chartex" xmlns:mc="http://schemas.openxmlformats.org/markup-compatibility/2006" xmlns:aink="http://schemas.microsoft.com/office/drawing/2016/ink" xmlns:am3d="http://schemas.microsoft.com/office/drawing/2017/model3d" xmlns:o="urn:schemas-microsoft-com:office:office" xmlns:oel="http://schemas.microsoft.com/office/2019/extlst" xmlns:r="http://schemas.openxmlformats.org/officeDocument/2006/relationships" xmlns:m="http://schemas.openxmlformats.org/officeDocument/2006/math" xmlns:v="urn:schemas-microsoft-com:vml" xmlns:wp14="http://schemas.microsoft.com/office/word/2010/wordprocessingDrawing" xmlns:wp="http://schemas.openxmlformats.org/drawingml/2006/wordprocessingDrawing" xmlns:w10="urn:schemas-microsoft-com:office:word" xmlns:w="http://schemas.openxmlformats.org/wordprocessingml/2006/main" xmlns:w14="http://schemas.microsoft.com/office/word/2010/wordml" xmlns:w15="http://schemas.microsoft.com/office/word/2012/wordml" xmlns:w16cex="http://schemas.microsoft.com/office/word/2018/wordml/cex" xmlns:w16cid="http://schemas.microsoft.com/office/word/2016/wordml/cid" xmlns:w16="http://schemas.microsoft.com/office/word/2018/wordml" xmlns:w16sdtdh="http://schemas.microsoft.com/office/word/2020/wordml/sdtdatahash" xmlns:w16se="http://schemas.microsoft.com/office/word/2015/wordml/symex" xmlns:wpg="http://schemas.microsoft.com/office/word/2010/wordprocessingGroup" xmlns:wpi="http://schemas.microsoft.com/office/word/2010/wordprocessingInk" xmlns:wne="http://schemas.microsoft.com/office/word/2006/wordml" xmlns:wps="http://schemas.microsoft.com/office/word/2010/wordprocessingShape" mc:Ignorable="w14 w15 w16se w16cid w16 w16cex w16sdtdh wp14">
+<w:numbering xmlns:wpc="http://schemas.microsoft.com/office/word/2010/wordprocessingCanvas" xmlns:cx="http://schemas.microsoft.com/office/drawing/2014/chartex" xmlns:cx1="http://schemas.microsoft.com/office/drawing/2015/9/8/chartex" xmlns:cx2="http://schemas.microsoft.com/office/drawing/2015/10/21/chartex" xmlns:cx3="http://schemas.microsoft.com/office/drawing/2016/5/9/chartex" xmlns:cx4="http://schemas.microsoft.com/office/drawing/2016/5/10/chartex" xmlns:cx5="http://schemas.microsoft.com/office/drawing/2016/5/11/chartex" xmlns:cx6="http://schemas.microsoft.com/office/drawing/2016/5/12/chartex" xmlns:cx7="http://schemas.microsoft.com/office/drawing/2016/5/13/chartex" xmlns:cx8="http://schemas.microsoft.com/office/drawing/2016/5/14/chartex" xmlns:mc="http://schemas.openxmlformats.org/markup-compatibility/2006" xmlns:aink="http://schemas.microsoft.com/office/drawing/2016/ink" xmlns:am3d="http://schemas.microsoft.com/office/drawing/2017/model3d" xmlns:o="urn:schemas-microsoft-com:office:office" xmlns:oel="http://schemas.microsoft.com/office/2019/extlst" xmlns:r="http://schemas.openxmlformats.org/officeDocument/2006/relationships" xmlns:m="http://schemas.openxmlformats.org/officeDocument/2006/math" xmlns:v="urn:schemas-microsoft-com:vml" xmlns:wp14="http://schemas.microsoft.com/office/word/2010/wordprocessingDrawing" xmlns:wp="http://schemas.openxmlformats.org/drawingml/2006/wordprocessingDrawing" xmlns:w10="urn:schemas-microsoft-com:office:word" xmlns:w="http://schemas.openxmlformats.org/wordprocessingml/2006/main" xmlns:w14="http://schemas.microsoft.com/office/word/2010/wordml" xmlns:w15="http://schemas.microsoft.com/office/word/2012/wordml" xmlns:w16cex="http://schemas.microsoft.com/office/word/2018/wordml/cex" xmlns:w16cid="http://schemas.microsoft.com/office/word/2016/wordml/cid" xmlns:w16="http://schemas.microsoft.com/office/word/2018/wordml" xmlns:w16du="http://schemas.microsoft.com/office/word/2023/wordml/word16du" xmlns:w16sdtdh="http://schemas.microsoft.com/office/word/2020/wordml/sdtdatahash" xmlns:w16sdtfl="http://schemas.microsoft.com/office/word/2024/wordml/sdtformatlock" xmlns:w16se="http://schemas.microsoft.com/office/word/2015/wordml/symex" xmlns:wpg="http://schemas.microsoft.com/office/word/2010/wordprocessingGroup" xmlns:wpi="http://schemas.microsoft.com/office/word/2010/wordprocessingInk" xmlns:wne="http://schemas.microsoft.com/office/word/2006/wordml" xmlns:wps="http://schemas.microsoft.com/office/word/2010/wordprocessingShape" mc:Ignorable="w14 w15 w16se w16cid w16 w16cex w16sdtdh w16sdtfl w16du wp14">
   <w:abstractNum w:abstractNumId="0" w15:restartNumberingAfterBreak="0">
     <w:nsid w:val="032730EB"/>
     <w:multiLevelType w:val="multilevel"/>
@@ -11515,7 +10619,7 @@
 </file>
 
 <file path=word/styles.xml><?xml version="1.0" encoding="utf-8"?>
-<w:styles xmlns:mc="http://schemas.openxmlformats.org/markup-compatibility/2006" xmlns:r="http://schemas.openxmlformats.org/officeDocument/2006/relationships" xmlns:w="http://schemas.openxmlformats.org/wordprocessingml/2006/main" xmlns:w14="http://schemas.microsoft.com/office/word/2010/wordml" xmlns:w15="http://schemas.microsoft.com/office/word/2012/wordml" xmlns:w16cex="http://schemas.microsoft.com/office/word/2018/wordml/cex" xmlns:w16cid="http://schemas.microsoft.com/office/word/2016/wordml/cid" xmlns:w16="http://schemas.microsoft.com/office/word/2018/wordml" xmlns:w16sdtdh="http://schemas.microsoft.com/office/word/2020/wordml/sdtdatahash" xmlns:w16se="http://schemas.microsoft.com/office/word/2015/wordml/symex" mc:Ignorable="w14 w15 w16se w16cid w16 w16cex w16sdtdh">
+<w:styles xmlns:mc="http://schemas.openxmlformats.org/markup-compatibility/2006" xmlns:r="http://schemas.openxmlformats.org/officeDocument/2006/relationships" xmlns:w="http://schemas.openxmlformats.org/wordprocessingml/2006/main" xmlns:w14="http://schemas.microsoft.com/office/word/2010/wordml" xmlns:w15="http://schemas.microsoft.com/office/word/2012/wordml" xmlns:w16cex="http://schemas.microsoft.com/office/word/2018/wordml/cex" xmlns:w16cid="http://schemas.microsoft.com/office/word/2016/wordml/cid" xmlns:w16="http://schemas.microsoft.com/office/word/2018/wordml" xmlns:w16du="http://schemas.microsoft.com/office/word/2023/wordml/word16du" xmlns:w16sdtdh="http://schemas.microsoft.com/office/word/2020/wordml/sdtdatahash" xmlns:w16sdtfl="http://schemas.microsoft.com/office/word/2024/wordml/sdtformatlock" xmlns:w16se="http://schemas.microsoft.com/office/word/2015/wordml/symex" mc:Ignorable="w14 w15 w16se w16cid w16 w16cex w16sdtdh w16sdtfl w16du">
   <w:docDefaults>
     <w:rPrDefault>
       <w:rPr>

</xml_diff>